<commit_message>
ADDING TODAY'S WORK - 04.08.2026
</commit_message>
<xml_diff>
--- a/viva/viva_presentation_plan.docx
+++ b/viva/viva_presentation_plan.docx
@@ -144,10 +144,7 @@
         </w:numPr>
       </w:pPr>
       <w:r>
-        <w:t>Bring backup pdf version</w:t>
-      </w:r>
-      <w:r>
-        <w:t xml:space="preserve"> in case </w:t>
+        <w:t xml:space="preserve">Bring backup pdf version in case </w:t>
       </w:r>
       <w:proofErr w:type="spellStart"/>
       <w:r>
@@ -235,13 +232,7 @@
         </w:numPr>
       </w:pPr>
       <w:r>
-        <w:t>Summarise at the end</w:t>
-      </w:r>
-      <w:r>
-        <w:t xml:space="preserve">: </w:t>
-      </w:r>
-      <w:r>
-        <w:t xml:space="preserve">Finish with key takeaways and invite questions: “In summary, this work shows X, contributes Y, and </w:t>
+        <w:t xml:space="preserve">Summarise at the end: Finish with key takeaways and invite questions: “In summary, this work shows X, contributes Y, and </w:t>
       </w:r>
       <w:proofErr w:type="gramStart"/>
       <w:r>
@@ -462,29 +453,53 @@
       <w:pPr>
         <w:pStyle w:val="ListParagraph"/>
         <w:numPr>
-          <w:ilvl w:val="0"/>
+          <w:ilvl w:val="1"/>
           <w:numId w:val="7"/>
         </w:numPr>
       </w:pPr>
       <w:r>
-        <w:t xml:space="preserve">Should figure legends </w:t>
-      </w:r>
-      <w:proofErr w:type="gramStart"/>
-      <w:r>
-        <w:t>say</w:t>
-      </w:r>
-      <w:proofErr w:type="gramEnd"/>
-      <w:r>
-        <w:t xml:space="preserve"> ‘made in </w:t>
-      </w:r>
+        <w:t>Increase the scale of all the axis titles and legends in figures. Do this in R for the axis text but just enlarge the legends manually</w:t>
+      </w:r>
+    </w:p>
+    <w:p>
+      <w:pPr>
+        <w:pStyle w:val="ListParagraph"/>
+        <w:numPr>
+          <w:ilvl w:val="0"/>
+          <w:numId w:val="7"/>
+        </w:numPr>
+      </w:pPr>
+      <w:r>
+        <w:t>Add slide numbers</w:t>
+      </w:r>
+    </w:p>
+    <w:p>
+      <w:pPr>
+        <w:pStyle w:val="ListParagraph"/>
+        <w:numPr>
+          <w:ilvl w:val="0"/>
+          <w:numId w:val="7"/>
+        </w:numPr>
+      </w:pPr>
       <w:proofErr w:type="spellStart"/>
       <w:r>
-        <w:t>biorender</w:t>
+        <w:t>Biorender</w:t>
       </w:r>
       <w:proofErr w:type="spellEnd"/>
       <w:r>
-        <w:t>’?</w:t>
-      </w:r>
+        <w:t xml:space="preserve"> citation for figure legend: </w:t>
+      </w:r>
+      <w:r>
+        <w:t xml:space="preserve">Created in  </w:t>
+      </w:r>
+      <w:hyperlink r:id="rId5" w:history="1">
+        <w:r>
+          <w:rPr>
+            <w:rStyle w:val="Hyperlink"/>
+          </w:rPr>
+          <w:t>https://BioRender.com</w:t>
+        </w:r>
+      </w:hyperlink>
     </w:p>
     <w:p>
       <w:pPr>
@@ -495,7 +510,28 @@
         </w:numPr>
       </w:pPr>
       <w:r>
-        <w:t>Add slide numbers</w:t>
+        <w:t>When talking, b</w:t>
+      </w:r>
+      <w:r>
+        <w:t xml:space="preserve">riefly explain the method and background for each results slide </w:t>
+      </w:r>
+      <w:r>
+        <w:t>[</w:t>
+      </w:r>
+      <w:r>
+        <w:t>and then some discussion</w:t>
+      </w:r>
+      <w:r>
+        <w:t>?]</w:t>
+      </w:r>
+      <w:r>
+        <w:t xml:space="preserve"> </w:t>
+      </w:r>
+      <w:r>
+        <w:t>because otherwise there might not be much to say</w:t>
+      </w:r>
+      <w:r>
+        <w:t>. The summary should always be stated at the end to keep the reader up to speed with the progression of the findings</w:t>
       </w:r>
     </w:p>
     <w:p>
@@ -506,23 +542,21 @@
           <w:numId w:val="7"/>
         </w:numPr>
       </w:pPr>
-      <w:proofErr w:type="spellStart"/>
-      <w:r>
-        <w:t>Biorender</w:t>
-      </w:r>
-      <w:proofErr w:type="spellEnd"/>
-      <w:r>
-        <w:t xml:space="preserve"> citation for figure legend: </w:t>
-      </w:r>
-      <w:r>
-        <w:t xml:space="preserve">Created </w:t>
-      </w:r>
-      <w:proofErr w:type="gramStart"/>
-      <w:r>
-        <w:t>in  https://BioRender.com</w:t>
-      </w:r>
-      <w:proofErr w:type="gramEnd"/>
-    </w:p>
+      <w:r>
+        <w:t xml:space="preserve">Do I want a slide </w:t>
+      </w:r>
+      <w:r>
+        <w:t xml:space="preserve">showing the ‘outlier’ samples e.g., heatmap and PCA? </w:t>
+      </w:r>
+      <w:r>
+        <w:rPr>
+          <w:b/>
+          <w:bCs/>
+        </w:rPr>
+        <w:t>Maybe if I have extra time that needs using</w:t>
+      </w:r>
+    </w:p>
+    <w:p/>
     <w:p/>
     <w:p>
       <w:r>
@@ -621,7 +655,6 @@
         </w:numPr>
       </w:pPr>
       <w:r>
-        <w:lastRenderedPageBreak/>
         <w:t>Background</w:t>
       </w:r>
     </w:p>
@@ -935,6 +968,7 @@
         </w:numPr>
       </w:pPr>
       <w:r>
+        <w:lastRenderedPageBreak/>
         <w:t xml:space="preserve">Literature of calu-3 </w:t>
       </w:r>
       <w:r>
@@ -995,20 +1029,329 @@
         </w:numPr>
       </w:pPr>
       <w:r>
+        <w:t xml:space="preserve">Provided framework to produce an in-house transcriptomics workflow to avoid repeated high-cost outsourcing meaning more resources to support additional research </w:t>
+      </w:r>
+    </w:p>
+    <w:p>
+      <w:pPr>
+        <w:pStyle w:val="ListParagraph"/>
+        <w:numPr>
+          <w:ilvl w:val="0"/>
+          <w:numId w:val="14"/>
+        </w:numPr>
+      </w:pPr>
+      <w:r>
+        <w:t>Background</w:t>
+      </w:r>
+    </w:p>
+    <w:p>
+      <w:pPr>
+        <w:pStyle w:val="ListParagraph"/>
+        <w:numPr>
+          <w:ilvl w:val="1"/>
+          <w:numId w:val="14"/>
+        </w:numPr>
+      </w:pPr>
+      <w:r>
+        <w:t xml:space="preserve">Allergens </w:t>
+      </w:r>
+    </w:p>
+    <w:p>
+      <w:pPr>
+        <w:pStyle w:val="ListParagraph"/>
+        <w:numPr>
+          <w:ilvl w:val="1"/>
+          <w:numId w:val="14"/>
+        </w:numPr>
+      </w:pPr>
+      <w:r>
+        <w:t>Epithelial barrier</w:t>
+      </w:r>
+    </w:p>
+    <w:p>
+      <w:pPr>
+        <w:pStyle w:val="ListParagraph"/>
+        <w:numPr>
+          <w:ilvl w:val="1"/>
+          <w:numId w:val="14"/>
+        </w:numPr>
+      </w:pPr>
+      <w:r>
+        <w:t>EVs as signallers / miRNA cargo</w:t>
+      </w:r>
+    </w:p>
+    <w:p>
+      <w:pPr>
+        <w:pStyle w:val="ListParagraph"/>
+        <w:numPr>
+          <w:ilvl w:val="1"/>
+          <w:numId w:val="14"/>
+        </w:numPr>
+      </w:pPr>
+      <w:r>
+        <w:t>miRNA post-transcriptionally fine-tune target genes via suppression</w:t>
+      </w:r>
+    </w:p>
+    <w:p>
+      <w:pPr>
+        <w:pStyle w:val="ListParagraph"/>
+        <w:numPr>
+          <w:ilvl w:val="1"/>
+          <w:numId w:val="14"/>
+        </w:numPr>
+      </w:pPr>
+      <w:r>
+        <w:t>Pathways can be affected</w:t>
+      </w:r>
+    </w:p>
+    <w:p>
+      <w:pPr>
+        <w:pStyle w:val="ListParagraph"/>
+        <w:numPr>
+          <w:ilvl w:val="1"/>
+          <w:numId w:val="14"/>
+        </w:numPr>
+      </w:pPr>
+      <w:r>
+        <w:t xml:space="preserve">Figure = </w:t>
+      </w:r>
+      <w:proofErr w:type="spellStart"/>
+      <w:r>
+        <w:t>biorender</w:t>
+      </w:r>
+      <w:proofErr w:type="spellEnd"/>
+      <w:r>
+        <w:t xml:space="preserve"> figure that shows each step </w:t>
+      </w:r>
+      <w:r>
+        <w:t>and</w:t>
+      </w:r>
+      <w:r>
+        <w:t xml:space="preserve"> I can explain each one in more detail</w:t>
+      </w:r>
+    </w:p>
+    <w:p>
+      <w:pPr>
+        <w:pStyle w:val="ListParagraph"/>
+        <w:numPr>
+          <w:ilvl w:val="2"/>
+          <w:numId w:val="14"/>
+        </w:numPr>
+      </w:pPr>
+      <w:r>
+        <w:t>The epithelial barrier as one long line. The different epithelial cells on basal side. Allergens interacting with the apical side of it. EVs produced in response to the allergen. miRNAs visible in the EV as two distinct colours (one for normal, the other for altered). miRNAs interacting and repressing with target genes. Pathways becoming altered.</w:t>
+      </w:r>
+    </w:p>
+    <w:p>
+      <w:pPr>
+        <w:pStyle w:val="ListParagraph"/>
+        <w:ind w:left="1440"/>
+      </w:pPr>
+    </w:p>
+    <w:p>
+      <w:pPr>
+        <w:pStyle w:val="ListParagraph"/>
+        <w:numPr>
+          <w:ilvl w:val="0"/>
+          <w:numId w:val="14"/>
+        </w:numPr>
+      </w:pPr>
+      <w:r>
+        <w:t>Study data</w:t>
+      </w:r>
+      <w:r>
+        <w:t xml:space="preserve"> / experimental design</w:t>
+      </w:r>
+    </w:p>
+    <w:p>
+      <w:pPr>
+        <w:pStyle w:val="ListParagraph"/>
+        <w:numPr>
+          <w:ilvl w:val="1"/>
+          <w:numId w:val="14"/>
+        </w:numPr>
+      </w:pPr>
+      <w:proofErr w:type="spellStart"/>
+      <w:r>
+        <w:t>Biorender</w:t>
+      </w:r>
+      <w:proofErr w:type="spellEnd"/>
+      <w:r>
+        <w:t xml:space="preserve"> figure </w:t>
+      </w:r>
+      <w:proofErr w:type="gramStart"/>
+      <w:r>
+        <w:t>similar to</w:t>
+      </w:r>
+      <w:proofErr w:type="gramEnd"/>
+      <w:r>
+        <w:t xml:space="preserve"> </w:t>
+      </w:r>
+      <w:proofErr w:type="spellStart"/>
+      <w:r>
+        <w:t>georgie’s</w:t>
+      </w:r>
+      <w:proofErr w:type="spellEnd"/>
+    </w:p>
+    <w:p>
+      <w:pPr>
+        <w:pStyle w:val="ListParagraph"/>
+        <w:numPr>
+          <w:ilvl w:val="2"/>
+          <w:numId w:val="14"/>
+        </w:numPr>
+      </w:pPr>
+      <w:r>
+        <w:t>Cell type</w:t>
+      </w:r>
+    </w:p>
+    <w:p>
+      <w:pPr>
+        <w:pStyle w:val="ListParagraph"/>
+        <w:numPr>
+          <w:ilvl w:val="2"/>
+          <w:numId w:val="14"/>
+        </w:numPr>
+      </w:pPr>
+      <w:r>
+        <w:t>Allergen type / nebuliser</w:t>
+      </w:r>
+    </w:p>
+    <w:p>
+      <w:pPr>
+        <w:pStyle w:val="ListParagraph"/>
+        <w:numPr>
+          <w:ilvl w:val="2"/>
+          <w:numId w:val="14"/>
+        </w:numPr>
+      </w:pPr>
+    </w:p>
+    <w:p>
+      <w:pPr>
+        <w:pStyle w:val="ListParagraph"/>
+        <w:numPr>
+          <w:ilvl w:val="0"/>
+          <w:numId w:val="14"/>
+        </w:numPr>
+      </w:pPr>
+      <w:r>
+        <w:t>Bioinformatics w</w:t>
+      </w:r>
+      <w:r>
+        <w:t>orkflow</w:t>
+      </w:r>
+    </w:p>
+    <w:p>
+      <w:pPr>
+        <w:pStyle w:val="ListParagraph"/>
+        <w:numPr>
+          <w:ilvl w:val="1"/>
+          <w:numId w:val="14"/>
+        </w:numPr>
+      </w:pPr>
+      <w:r>
+        <w:t>Trimming -&gt; qc -&gt; mapping -&gt; quantification -&gt; de analysis -&gt; pathway enrichment analysis / literature search</w:t>
+      </w:r>
+      <w:r>
+        <w:rPr>
+          <w:rFonts w:ascii="Aptos" w:hAnsi="Aptos"/>
+        </w:rPr>
+        <w:t>µ</w:t>
+      </w:r>
+    </w:p>
+    <w:p>
+      <w:pPr>
+        <w:pStyle w:val="ListParagraph"/>
+        <w:numPr>
+          <w:ilvl w:val="0"/>
+          <w:numId w:val="14"/>
+        </w:numPr>
+      </w:pPr>
+      <w:r>
+        <w:t>Findings (1)</w:t>
+      </w:r>
+    </w:p>
+    <w:p>
+      <w:pPr>
+        <w:pStyle w:val="ListParagraph"/>
+        <w:numPr>
+          <w:ilvl w:val="1"/>
+          <w:numId w:val="14"/>
+        </w:numPr>
+      </w:pPr>
+      <w:r>
+        <w:t xml:space="preserve">Main point = RNA composition differs in 24 </w:t>
+      </w:r>
+      <w:proofErr w:type="gramStart"/>
+      <w:r>
+        <w:t>protease</w:t>
+      </w:r>
+      <w:proofErr w:type="gramEnd"/>
+      <w:r>
+        <w:t xml:space="preserve"> compared to rest</w:t>
+      </w:r>
+      <w:r>
+        <w:t xml:space="preserve"> of protease</w:t>
+      </w:r>
+    </w:p>
+    <w:p>
+      <w:pPr>
+        <w:pStyle w:val="ListParagraph"/>
+        <w:numPr>
+          <w:ilvl w:val="1"/>
+          <w:numId w:val="14"/>
+        </w:numPr>
+      </w:pPr>
+      <w:r>
+        <w:t>Main point = very little miRNA in calu-3 dataset</w:t>
+      </w:r>
+    </w:p>
+    <w:p>
+      <w:pPr>
+        <w:pStyle w:val="ListParagraph"/>
+        <w:numPr>
+          <w:ilvl w:val="1"/>
+          <w:numId w:val="14"/>
+        </w:numPr>
+      </w:pPr>
+      <w:r>
+        <w:t>Figure = RNA composition graph for primary and calu-3</w:t>
+      </w:r>
+    </w:p>
+    <w:p>
+      <w:pPr>
+        <w:pStyle w:val="ListParagraph"/>
+        <w:numPr>
+          <w:ilvl w:val="0"/>
+          <w:numId w:val="14"/>
+        </w:numPr>
+      </w:pPr>
+      <w:r>
+        <w:t>Findings (2)</w:t>
+      </w:r>
+    </w:p>
+    <w:p>
+      <w:pPr>
+        <w:pStyle w:val="ListParagraph"/>
+        <w:numPr>
+          <w:ilvl w:val="1"/>
+          <w:numId w:val="14"/>
+        </w:numPr>
+      </w:pPr>
+      <w:r>
         <w:lastRenderedPageBreak/>
-        <w:t xml:space="preserve">Provided framework to produce an in-house transcriptomics workflow to avoid repeated high-cost outsourcing meaning more resources to support additional research </w:t>
-      </w:r>
-    </w:p>
-    <w:p>
-      <w:pPr>
-        <w:pStyle w:val="ListParagraph"/>
-        <w:numPr>
-          <w:ilvl w:val="0"/>
-          <w:numId w:val="14"/>
-        </w:numPr>
-      </w:pPr>
-      <w:r>
-        <w:t>Background</w:t>
+        <w:t>Main point =</w:t>
+      </w:r>
+      <w:r>
+        <w:t xml:space="preserve"> differential expression highest in 24 </w:t>
+      </w:r>
+      <w:proofErr w:type="gramStart"/>
+      <w:r>
+        <w:t>protease</w:t>
+      </w:r>
+      <w:proofErr w:type="gramEnd"/>
+      <w:r>
+        <w:t xml:space="preserve"> compared to rest of protease </w:t>
       </w:r>
     </w:p>
     <w:p>
@@ -1020,7 +1363,7 @@
         </w:numPr>
       </w:pPr>
       <w:r>
-        <w:t xml:space="preserve">Allergens </w:t>
+        <w:t>Main point = limited calu-3 differential expression, even at exploratory FDR threshold</w:t>
       </w:r>
     </w:p>
     <w:p>
@@ -1032,7 +1375,19 @@
         </w:numPr>
       </w:pPr>
       <w:r>
-        <w:t>Epithelial barrier</w:t>
+        <w:t>Figure = bar chart of differential expression (have the one extra calu-3 de miRNA in a bright colour to represent the exploratory threshold)</w:t>
+      </w:r>
+    </w:p>
+    <w:p>
+      <w:pPr>
+        <w:pStyle w:val="ListParagraph"/>
+        <w:numPr>
+          <w:ilvl w:val="0"/>
+          <w:numId w:val="14"/>
+        </w:numPr>
+      </w:pPr>
+      <w:r>
+        <w:t>Findings (3)</w:t>
       </w:r>
     </w:p>
     <w:p>
@@ -1044,8 +1399,16 @@
         </w:numPr>
       </w:pPr>
       <w:r>
-        <w:t>EVs as signallers / miRNA cargo</w:t>
-      </w:r>
+        <w:t>Main point =</w:t>
+      </w:r>
+      <w:r>
+        <w:t xml:space="preserve"> target-gene level enrichment provided biologically plausible results for 24 </w:t>
+      </w:r>
+      <w:proofErr w:type="gramStart"/>
+      <w:r>
+        <w:t>protease</w:t>
+      </w:r>
+      <w:proofErr w:type="gramEnd"/>
     </w:p>
     <w:p>
       <w:pPr>
@@ -1056,7 +1419,7 @@
         </w:numPr>
       </w:pPr>
       <w:r>
-        <w:t>miRNA post-transcriptionally fine-tune target genes via suppression</w:t>
+        <w:t xml:space="preserve">Main point = miRNA-level enrichment was not very informative </w:t>
       </w:r>
     </w:p>
     <w:p>
@@ -1068,7 +1431,43 @@
         </w:numPr>
       </w:pPr>
       <w:r>
-        <w:t>Pathways can be affected</w:t>
+        <w:t xml:space="preserve">Figure = </w:t>
+      </w:r>
+      <w:proofErr w:type="spellStart"/>
+      <w:r>
+        <w:t>dotplot</w:t>
+      </w:r>
+      <w:proofErr w:type="spellEnd"/>
+      <w:r>
+        <w:t xml:space="preserve"> of up- or down-regulated pathways on the left and the </w:t>
+      </w:r>
+      <w:proofErr w:type="spellStart"/>
+      <w:r>
+        <w:t>miEAA</w:t>
+      </w:r>
+      <w:proofErr w:type="spellEnd"/>
+      <w:r>
+        <w:t xml:space="preserve"> </w:t>
+      </w:r>
+      <w:proofErr w:type="spellStart"/>
+      <w:r>
+        <w:t>wordplot</w:t>
+      </w:r>
+      <w:proofErr w:type="spellEnd"/>
+      <w:r>
+        <w:t xml:space="preserve"> on the right</w:t>
+      </w:r>
+    </w:p>
+    <w:p>
+      <w:pPr>
+        <w:pStyle w:val="ListParagraph"/>
+        <w:numPr>
+          <w:ilvl w:val="0"/>
+          <w:numId w:val="14"/>
+        </w:numPr>
+      </w:pPr>
+      <w:r>
+        <w:t>Findings (4)</w:t>
       </w:r>
     </w:p>
     <w:p>
@@ -1080,7 +1479,76 @@
         </w:numPr>
       </w:pPr>
       <w:r>
-        <w:t xml:space="preserve">Figure = </w:t>
+        <w:t>Main point =</w:t>
+      </w:r>
+      <w:r>
+        <w:t xml:space="preserve"> de miRNAs from Can f 1 in calu-3 dataset have been associated with immune-related pathways though </w:t>
+      </w:r>
+      <w:r>
+        <w:t xml:space="preserve">these may not relate to airway biology (although some do). More support for 125 over 574. </w:t>
+      </w:r>
+    </w:p>
+    <w:p>
+      <w:pPr>
+        <w:pStyle w:val="ListParagraph"/>
+        <w:numPr>
+          <w:ilvl w:val="1"/>
+          <w:numId w:val="14"/>
+        </w:numPr>
+      </w:pPr>
+      <w:r>
+        <w:t>main point = 125 also detected in protease dataset</w:t>
+      </w:r>
+    </w:p>
+    <w:p>
+      <w:pPr>
+        <w:pStyle w:val="ListParagraph"/>
+        <w:numPr>
+          <w:ilvl w:val="1"/>
+          <w:numId w:val="14"/>
+        </w:numPr>
+      </w:pPr>
+      <w:r>
+        <w:t>Figure = pie chart of 125 and 574 with the ratio of publications in each category searched for and the total number of publications very clearly marked above or under the chart</w:t>
+      </w:r>
+    </w:p>
+    <w:p>
+      <w:pPr>
+        <w:pStyle w:val="ListParagraph"/>
+        <w:numPr>
+          <w:ilvl w:val="0"/>
+          <w:numId w:val="14"/>
+        </w:numPr>
+      </w:pPr>
+      <w:r>
+        <w:t>Findings (5)</w:t>
+      </w:r>
+      <w:r>
+        <w:t xml:space="preserve"> [move this section to after discussion of findings?]</w:t>
+      </w:r>
+    </w:p>
+    <w:p>
+      <w:pPr>
+        <w:pStyle w:val="ListParagraph"/>
+        <w:numPr>
+          <w:ilvl w:val="1"/>
+          <w:numId w:val="14"/>
+        </w:numPr>
+      </w:pPr>
+      <w:r>
+        <w:t>Main point = experimental optimisations to enable robust analysis of future calu-3 datasets</w:t>
+      </w:r>
+    </w:p>
+    <w:p>
+      <w:pPr>
+        <w:pStyle w:val="ListParagraph"/>
+        <w:numPr>
+          <w:ilvl w:val="1"/>
+          <w:numId w:val="14"/>
+        </w:numPr>
+      </w:pPr>
+      <w:r>
+        <w:t xml:space="preserve">Figure = instead of a list of points make a </w:t>
       </w:r>
       <w:proofErr w:type="spellStart"/>
       <w:r>
@@ -1088,13 +1556,7 @@
       </w:r>
       <w:proofErr w:type="spellEnd"/>
       <w:r>
-        <w:t xml:space="preserve"> figure that shows each step </w:t>
-      </w:r>
-      <w:r>
-        <w:t>and</w:t>
-      </w:r>
-      <w:r>
-        <w:t xml:space="preserve"> I can explain each one in more detail</w:t>
+        <w:t xml:space="preserve"> figure with each point associated with an image (this will increase engagement)</w:t>
       </w:r>
     </w:p>
     <w:p>
@@ -1106,59 +1568,8 @@
         </w:numPr>
       </w:pPr>
       <w:r>
-        <w:t>The epithelial barrier as one long line. The different epithelial cells on basal side. Allergens interacting with the apical side of it. EVs produced in response to the allergen. miRNAs visible in the EV as two distinct colours (one for normal, the other for altered). miRNAs interacting and repressing with target genes. Pathways becoming altered.</w:t>
-      </w:r>
-    </w:p>
-    <w:p>
-      <w:pPr>
-        <w:pStyle w:val="ListParagraph"/>
-        <w:ind w:left="1440"/>
-      </w:pPr>
-    </w:p>
-    <w:p>
-      <w:pPr>
-        <w:pStyle w:val="ListParagraph"/>
-        <w:numPr>
-          <w:ilvl w:val="0"/>
-          <w:numId w:val="14"/>
-        </w:numPr>
-      </w:pPr>
-      <w:r>
-        <w:t>Study data</w:t>
-      </w:r>
-      <w:r>
-        <w:t xml:space="preserve"> / experimental design</w:t>
-      </w:r>
-    </w:p>
-    <w:p>
-      <w:pPr>
-        <w:pStyle w:val="ListParagraph"/>
-        <w:numPr>
-          <w:ilvl w:val="1"/>
-          <w:numId w:val="14"/>
-        </w:numPr>
-      </w:pPr>
-      <w:proofErr w:type="spellStart"/>
-      <w:r>
-        <w:t>Biorender</w:t>
-      </w:r>
-      <w:proofErr w:type="spellEnd"/>
-      <w:r>
-        <w:t xml:space="preserve"> figure </w:t>
-      </w:r>
-      <w:proofErr w:type="gramStart"/>
-      <w:r>
-        <w:t>similar to</w:t>
-      </w:r>
-      <w:proofErr w:type="gramEnd"/>
-      <w:r>
-        <w:t xml:space="preserve"> </w:t>
-      </w:r>
-      <w:proofErr w:type="spellStart"/>
-      <w:r>
-        <w:t>georgie’s</w:t>
-      </w:r>
-      <w:proofErr w:type="spellEnd"/>
+        <w:t>Increase sample size</w:t>
+      </w:r>
     </w:p>
     <w:p>
       <w:pPr>
@@ -1169,7 +1580,7 @@
         </w:numPr>
       </w:pPr>
       <w:r>
-        <w:t>Cell type</w:t>
+        <w:t xml:space="preserve">Increase the amount of EVs collected to increase the amount of miRNA to analyse </w:t>
       </w:r>
     </w:p>
     <w:p>
@@ -1181,353 +1592,14 @@
         </w:numPr>
       </w:pPr>
       <w:r>
-        <w:t>Allergen type / nebuliser</w:t>
-      </w:r>
-    </w:p>
-    <w:p>
-      <w:pPr>
-        <w:pStyle w:val="ListParagraph"/>
-        <w:numPr>
-          <w:ilvl w:val="2"/>
-          <w:numId w:val="14"/>
-        </w:numPr>
-      </w:pPr>
-    </w:p>
-    <w:p>
-      <w:pPr>
-        <w:pStyle w:val="ListParagraph"/>
-        <w:numPr>
-          <w:ilvl w:val="0"/>
-          <w:numId w:val="14"/>
-        </w:numPr>
-      </w:pPr>
-      <w:r>
-        <w:t>Bioinformatics w</w:t>
-      </w:r>
-      <w:r>
-        <w:t>orkflow</w:t>
-      </w:r>
-    </w:p>
-    <w:p>
-      <w:pPr>
-        <w:pStyle w:val="ListParagraph"/>
-        <w:numPr>
-          <w:ilvl w:val="1"/>
-          <w:numId w:val="14"/>
-        </w:numPr>
-      </w:pPr>
-      <w:r>
-        <w:t>Trimming -&gt; qc -&gt; mapping -&gt; quantification -&gt; de analysis -&gt; pathway enrichment analysis / literature search</w:t>
-      </w:r>
-    </w:p>
-    <w:p>
-      <w:pPr>
-        <w:pStyle w:val="ListParagraph"/>
-        <w:numPr>
-          <w:ilvl w:val="0"/>
-          <w:numId w:val="14"/>
-        </w:numPr>
-      </w:pPr>
-      <w:r>
-        <w:t>Findings (1)</w:t>
-      </w:r>
-    </w:p>
-    <w:p>
-      <w:pPr>
-        <w:pStyle w:val="ListParagraph"/>
-        <w:numPr>
-          <w:ilvl w:val="1"/>
-          <w:numId w:val="14"/>
-        </w:numPr>
-      </w:pPr>
-      <w:r>
-        <w:t xml:space="preserve">Main point = RNA composition differs in 24 </w:t>
-      </w:r>
-      <w:proofErr w:type="gramStart"/>
-      <w:r>
-        <w:t>protease</w:t>
-      </w:r>
-      <w:proofErr w:type="gramEnd"/>
-      <w:r>
-        <w:t xml:space="preserve"> compared to rest</w:t>
-      </w:r>
-      <w:r>
-        <w:t xml:space="preserve"> of protease</w:t>
-      </w:r>
-    </w:p>
-    <w:p>
-      <w:pPr>
-        <w:pStyle w:val="ListParagraph"/>
-        <w:numPr>
-          <w:ilvl w:val="1"/>
-          <w:numId w:val="14"/>
-        </w:numPr>
-      </w:pPr>
-      <w:r>
-        <w:t>Main point = very little miRNA in calu-3 dataset</w:t>
-      </w:r>
-    </w:p>
-    <w:p>
-      <w:pPr>
-        <w:pStyle w:val="ListParagraph"/>
-        <w:numPr>
-          <w:ilvl w:val="1"/>
-          <w:numId w:val="14"/>
-        </w:numPr>
-      </w:pPr>
-      <w:r>
-        <w:t>Figure = RNA composition graph for primary and calu-3</w:t>
-      </w:r>
-    </w:p>
-    <w:p>
-      <w:pPr>
-        <w:pStyle w:val="ListParagraph"/>
-        <w:numPr>
-          <w:ilvl w:val="0"/>
-          <w:numId w:val="14"/>
-        </w:numPr>
-      </w:pPr>
-      <w:r>
-        <w:t>Findings (2)</w:t>
-      </w:r>
-    </w:p>
-    <w:p>
-      <w:pPr>
-        <w:pStyle w:val="ListParagraph"/>
-        <w:numPr>
-          <w:ilvl w:val="1"/>
-          <w:numId w:val="14"/>
-        </w:numPr>
-      </w:pPr>
-      <w:r>
-        <w:t>Main point =</w:t>
-      </w:r>
-      <w:r>
-        <w:t xml:space="preserve"> differential expression highest in 24 </w:t>
-      </w:r>
-      <w:proofErr w:type="gramStart"/>
-      <w:r>
-        <w:t>protease</w:t>
-      </w:r>
-      <w:proofErr w:type="gramEnd"/>
-      <w:r>
-        <w:t xml:space="preserve"> compared to rest of protease </w:t>
-      </w:r>
-    </w:p>
-    <w:p>
-      <w:pPr>
-        <w:pStyle w:val="ListParagraph"/>
-        <w:numPr>
-          <w:ilvl w:val="1"/>
-          <w:numId w:val="14"/>
-        </w:numPr>
-      </w:pPr>
-      <w:r>
-        <w:t>Main point = limited calu-3 differential expression, even at exploratory FDR threshold</w:t>
-      </w:r>
-    </w:p>
-    <w:p>
-      <w:pPr>
-        <w:pStyle w:val="ListParagraph"/>
-        <w:numPr>
-          <w:ilvl w:val="1"/>
-          <w:numId w:val="14"/>
-        </w:numPr>
-      </w:pPr>
-      <w:r>
-        <w:t xml:space="preserve">Figure = </w:t>
-      </w:r>
-      <w:r>
-        <w:t>bar chart of differential expression (have the one extra calu-3 de miRNA in a bright colour to represent the exploratory threshold)</w:t>
-      </w:r>
-    </w:p>
-    <w:p>
-      <w:pPr>
-        <w:pStyle w:val="ListParagraph"/>
-        <w:numPr>
-          <w:ilvl w:val="0"/>
-          <w:numId w:val="14"/>
-        </w:numPr>
-      </w:pPr>
-      <w:r>
-        <w:t>Findings (3)</w:t>
-      </w:r>
-    </w:p>
-    <w:p>
-      <w:pPr>
-        <w:pStyle w:val="ListParagraph"/>
-        <w:numPr>
-          <w:ilvl w:val="1"/>
-          <w:numId w:val="14"/>
-        </w:numPr>
-      </w:pPr>
-      <w:r>
-        <w:t>Main point =</w:t>
-      </w:r>
-      <w:r>
-        <w:t xml:space="preserve"> target-gene level enrichment provided biologically plausible results for 24 </w:t>
-      </w:r>
-      <w:proofErr w:type="gramStart"/>
-      <w:r>
-        <w:t>protease</w:t>
-      </w:r>
-      <w:proofErr w:type="gramEnd"/>
-    </w:p>
-    <w:p>
-      <w:pPr>
-        <w:pStyle w:val="ListParagraph"/>
-        <w:numPr>
-          <w:ilvl w:val="1"/>
-          <w:numId w:val="14"/>
-        </w:numPr>
-      </w:pPr>
-      <w:r>
-        <w:lastRenderedPageBreak/>
-        <w:t xml:space="preserve">Main point = miRNA-level enrichment was not very informative </w:t>
-      </w:r>
-    </w:p>
-    <w:p>
-      <w:pPr>
-        <w:pStyle w:val="ListParagraph"/>
-        <w:numPr>
-          <w:ilvl w:val="1"/>
-          <w:numId w:val="14"/>
-        </w:numPr>
-      </w:pPr>
-      <w:r>
-        <w:t xml:space="preserve">Figure = </w:t>
-      </w:r>
-      <w:proofErr w:type="spellStart"/>
-      <w:r>
-        <w:t>dotplot</w:t>
-      </w:r>
-      <w:proofErr w:type="spellEnd"/>
-      <w:r>
-        <w:t xml:space="preserve"> of up- or down-regulated pathways on the left and the </w:t>
-      </w:r>
-      <w:proofErr w:type="spellStart"/>
-      <w:r>
-        <w:t>miEAA</w:t>
-      </w:r>
-      <w:proofErr w:type="spellEnd"/>
-      <w:r>
-        <w:t xml:space="preserve"> </w:t>
-      </w:r>
-      <w:proofErr w:type="spellStart"/>
-      <w:r>
-        <w:t>wordplot</w:t>
-      </w:r>
-      <w:proofErr w:type="spellEnd"/>
-      <w:r>
-        <w:t xml:space="preserve"> on the right</w:t>
-      </w:r>
-    </w:p>
-    <w:p>
-      <w:pPr>
-        <w:pStyle w:val="ListParagraph"/>
-        <w:numPr>
-          <w:ilvl w:val="0"/>
-          <w:numId w:val="14"/>
-        </w:numPr>
-      </w:pPr>
-      <w:r>
-        <w:t>Findings (4)</w:t>
-      </w:r>
-    </w:p>
-    <w:p>
-      <w:pPr>
-        <w:pStyle w:val="ListParagraph"/>
-        <w:numPr>
-          <w:ilvl w:val="1"/>
-          <w:numId w:val="14"/>
-        </w:numPr>
-      </w:pPr>
-      <w:r>
-        <w:t>Main point =</w:t>
-      </w:r>
-      <w:r>
-        <w:t xml:space="preserve"> de miRNAs from Can f 1 in calu-3 dataset have been associated with immune-related pathways though </w:t>
-      </w:r>
-      <w:r>
-        <w:t xml:space="preserve">these may not relate to airway biology (although some do). More support for 125 over 574. </w:t>
-      </w:r>
-    </w:p>
-    <w:p>
-      <w:pPr>
-        <w:pStyle w:val="ListParagraph"/>
-        <w:numPr>
-          <w:ilvl w:val="1"/>
-          <w:numId w:val="14"/>
-        </w:numPr>
-      </w:pPr>
-      <w:r>
-        <w:t>main point = 125 also detected in protease dataset</w:t>
-      </w:r>
-    </w:p>
-    <w:p>
-      <w:pPr>
-        <w:pStyle w:val="ListParagraph"/>
-        <w:numPr>
-          <w:ilvl w:val="1"/>
-          <w:numId w:val="14"/>
-        </w:numPr>
-      </w:pPr>
-      <w:r>
-        <w:t xml:space="preserve">Figure = </w:t>
-      </w:r>
-      <w:r>
-        <w:t>pie chart of 125 and 574 with the ratio of publications in each category searched for and the total number of publications very clearly marked above or under the chart</w:t>
-      </w:r>
-    </w:p>
-    <w:p>
-      <w:pPr>
-        <w:pStyle w:val="ListParagraph"/>
-        <w:numPr>
-          <w:ilvl w:val="0"/>
-          <w:numId w:val="14"/>
-        </w:numPr>
-      </w:pPr>
-      <w:r>
-        <w:t>Findings (</w:t>
-      </w:r>
-      <w:r>
-        <w:t>5</w:t>
-      </w:r>
-      <w:r>
-        <w:t>)</w:t>
-      </w:r>
-    </w:p>
-    <w:p>
-      <w:pPr>
-        <w:pStyle w:val="ListParagraph"/>
-        <w:numPr>
-          <w:ilvl w:val="1"/>
-          <w:numId w:val="14"/>
-        </w:numPr>
-      </w:pPr>
-      <w:r>
-        <w:t>Main point = experimental optimisations to enable robust analysis of future calu-3 datasets</w:t>
-      </w:r>
-    </w:p>
-    <w:p>
-      <w:pPr>
-        <w:pStyle w:val="ListParagraph"/>
-        <w:numPr>
-          <w:ilvl w:val="1"/>
-          <w:numId w:val="14"/>
-        </w:numPr>
-      </w:pPr>
-      <w:r>
-        <w:t xml:space="preserve">Figure = instead of a list of points make a </w:t>
-      </w:r>
-      <w:proofErr w:type="spellStart"/>
-      <w:r>
-        <w:t>biorender</w:t>
-      </w:r>
-      <w:proofErr w:type="spellEnd"/>
-      <w:r>
-        <w:t xml:space="preserve"> figure with each point associated with an image (this will increase engagement)</w:t>
-      </w:r>
+        <w:t xml:space="preserve">Integrate matched miRNA-mRNA </w:t>
+      </w:r>
+    </w:p>
+    <w:p>
+      <w:pPr>
+        <w:pStyle w:val="ListParagraph"/>
+        <w:ind w:left="2160"/>
+      </w:pPr>
     </w:p>
     <w:p>
       <w:pPr>
@@ -1539,6 +1611,21 @@
       </w:pPr>
       <w:r>
         <w:t>Significance / originality</w:t>
+      </w:r>
+      <w:r>
+        <w:t xml:space="preserve"> [is</w:t>
+      </w:r>
+      <w:r>
+        <w:t xml:space="preserve"> this</w:t>
+      </w:r>
+      <w:r>
+        <w:t xml:space="preserve"> discussion</w:t>
+      </w:r>
+      <w:r>
+        <w:t>?</w:t>
+      </w:r>
+      <w:r>
+        <w:t>]</w:t>
       </w:r>
     </w:p>
     <w:p>
@@ -1562,31 +1649,7 @@
         </w:numPr>
       </w:pPr>
       <w:r>
-        <w:t>Identified limitations of a dataset intended for publication which may contain unsupported findings</w:t>
-      </w:r>
-    </w:p>
-    <w:p>
-      <w:pPr>
-        <w:pStyle w:val="ListParagraph"/>
-        <w:numPr>
-          <w:ilvl w:val="1"/>
-          <w:numId w:val="14"/>
-        </w:numPr>
-      </w:pPr>
-      <w:r>
-        <w:t>Identified experimental limitations and offered guidance to produce usable data for the future experiments</w:t>
-      </w:r>
-    </w:p>
-    <w:p>
-      <w:pPr>
-        <w:pStyle w:val="ListParagraph"/>
-        <w:numPr>
-          <w:ilvl w:val="1"/>
-          <w:numId w:val="14"/>
-        </w:numPr>
-      </w:pPr>
-      <w:r>
-        <w:t xml:space="preserve">Provided framework to produce an in-house transcriptomics workflow to avoid repeated high-cost outsourcing meaning more resources to support additional research </w:t>
+        <w:t>[]</w:t>
       </w:r>
     </w:p>
     <w:p>
@@ -1607,7 +1670,7 @@
         <w:t>Originality</w:t>
       </w:r>
       <w:r>
-        <w:t xml:space="preserve"> [this section needs reviewing]</w:t>
+        <w:t xml:space="preserve"> </w:t>
       </w:r>
     </w:p>
     <w:p>
@@ -1619,95 +1682,11 @@
         </w:numPr>
       </w:pPr>
       <w:r>
-        <w:t xml:space="preserve">Allergen studies using nebuliser technology build on previous </w:t>
-      </w:r>
-      <w:r>
-        <w:t xml:space="preserve">allergen </w:t>
-      </w:r>
-      <w:r>
-        <w:t>studies using submersion techniques making the analysis relevant</w:t>
-      </w:r>
-    </w:p>
-    <w:p>
-      <w:pPr>
-        <w:pStyle w:val="ListParagraph"/>
-        <w:numPr>
-          <w:ilvl w:val="1"/>
-          <w:numId w:val="14"/>
-        </w:numPr>
-      </w:pPr>
-      <w:r>
-        <w:t>Pathway</w:t>
-      </w:r>
-      <w:r>
-        <w:t xml:space="preserve"> enrichment</w:t>
-      </w:r>
-      <w:r>
-        <w:t xml:space="preserve"> analysis of Calu-3 DE miRNAs had not previously been performed. Although it still hasn’t, the workflow is prepared for it.</w:t>
-      </w:r>
-    </w:p>
-    <w:p>
-      <w:pPr>
-        <w:pStyle w:val="ListParagraph"/>
-        <w:numPr>
-          <w:ilvl w:val="1"/>
-          <w:numId w:val="14"/>
-        </w:numPr>
-      </w:pPr>
-      <w:r>
-        <w:t>Other studies have provided overviews of</w:t>
-      </w:r>
-      <w:r>
-        <w:t xml:space="preserve"> similar</w:t>
+        <w:t>[]</w:t>
       </w:r>
       <w:r>
         <w:t xml:space="preserve"> </w:t>
       </w:r>
-      <w:r>
-        <w:t xml:space="preserve">open-access </w:t>
-      </w:r>
-      <w:r>
-        <w:t xml:space="preserve">workflows e.g., </w:t>
-      </w:r>
-      <w:r>
-        <w:t xml:space="preserve">what </w:t>
-      </w:r>
-      <w:r>
-        <w:t>software to use</w:t>
-      </w:r>
-      <w:r>
-        <w:t xml:space="preserve"> and</w:t>
-      </w:r>
-      <w:r>
-        <w:t xml:space="preserve"> full code </w:t>
-      </w:r>
-      <w:r>
-        <w:t xml:space="preserve">examples </w:t>
-      </w:r>
-      <w:r>
-        <w:t xml:space="preserve">can be found in open-source </w:t>
-      </w:r>
-      <w:r>
-        <w:t>workflows,</w:t>
-      </w:r>
-      <w:r>
-        <w:t xml:space="preserve"> but</w:t>
-      </w:r>
-      <w:r>
-        <w:t xml:space="preserve"> this</w:t>
-      </w:r>
-      <w:r>
-        <w:t xml:space="preserve"> is often complex. This workflow bridges the gap by providing a simple, reproducible workflow</w:t>
-      </w:r>
-      <w:r>
-        <w:t xml:space="preserve"> that</w:t>
-      </w:r>
-    </w:p>
-    <w:p>
-      <w:pPr>
-        <w:pStyle w:val="ListParagraph"/>
-        <w:ind w:left="1440"/>
-      </w:pPr>
     </w:p>
     <w:p>
       <w:pPr>
@@ -1782,10 +1761,7 @@
         <w:t>against known findings (I did a bit of this but didn’t put it in the report)</w:t>
       </w:r>
       <w:r>
-        <w:t xml:space="preserve">, commercial platforms and </w:t>
-      </w:r>
-      <w:r>
-        <w:t>using published data/findings</w:t>
+        <w:t>, commercial platforms and using published data/findings</w:t>
       </w:r>
     </w:p>
     <w:p>
@@ -1806,10 +1782,7 @@
         <w:t xml:space="preserve"> </w:t>
       </w:r>
       <w:r>
-        <w:t xml:space="preserve">data </w:t>
-      </w:r>
-      <w:r>
-        <w:t xml:space="preserve">for </w:t>
+        <w:t xml:space="preserve">data for </w:t>
       </w:r>
       <w:r>
         <w:t xml:space="preserve">Calu-3 </w:t>
@@ -1875,13 +1848,7 @@
         </w:numPr>
       </w:pPr>
       <w:r>
-        <w:t xml:space="preserve">Aimed to </w:t>
-      </w:r>
-      <w:r>
-        <w:t>perform pathway analysis on calu-3 dataset</w:t>
-      </w:r>
-      <w:r>
-        <w:t xml:space="preserve"> however this was not possible due to too few </w:t>
+        <w:t xml:space="preserve">Aimed to perform pathway analysis on calu-3 dataset however this was not possible due to too few </w:t>
       </w:r>
       <w:r>
         <w:t>DE</w:t>
@@ -1893,10 +1860,7 @@
         <w:t>miRNAs</w:t>
       </w:r>
       <w:r>
-        <w:t xml:space="preserve"> therefore </w:t>
-      </w:r>
-      <w:r>
-        <w:t>I diagnosed the problem and found ways to enable the analysis in future experiments.</w:t>
+        <w:t xml:space="preserve"> therefore I diagnosed the problem and found ways to enable the analysis in future experiments.</w:t>
       </w:r>
     </w:p>
     <w:p>
@@ -1928,7 +1892,152 @@
         <w:pStyle w:val="ListParagraph"/>
       </w:pPr>
     </w:p>
-    <w:p/>
+    <w:p>
+      <w:pPr>
+        <w:rPr>
+          <w:b/>
+          <w:bCs/>
+        </w:rPr>
+      </w:pPr>
+      <w:r>
+        <w:rPr>
+          <w:b/>
+          <w:bCs/>
+          <w:sz w:val="36"/>
+          <w:szCs w:val="36"/>
+        </w:rPr>
+        <w:t>Archive</w:t>
+      </w:r>
+    </w:p>
+    <w:p>
+      <w:pPr>
+        <w:pStyle w:val="ListParagraph"/>
+        <w:numPr>
+          <w:ilvl w:val="0"/>
+          <w:numId w:val="15"/>
+        </w:numPr>
+      </w:pPr>
+      <w:r>
+        <w:t>Significance / originality</w:t>
+      </w:r>
+    </w:p>
+    <w:p>
+      <w:pPr>
+        <w:pStyle w:val="ListParagraph"/>
+        <w:ind w:left="1440"/>
+      </w:pPr>
+      <w:r>
+        <w:rPr>
+          <w:u w:val="single"/>
+        </w:rPr>
+        <w:t>Significance</w:t>
+      </w:r>
+    </w:p>
+    <w:p>
+      <w:pPr>
+        <w:pStyle w:val="ListParagraph"/>
+        <w:numPr>
+          <w:ilvl w:val="1"/>
+          <w:numId w:val="15"/>
+        </w:numPr>
+      </w:pPr>
+      <w:r>
+        <w:t>Identified limitations of a dataset intended for publication which may contain unsupported findings</w:t>
+      </w:r>
+    </w:p>
+    <w:p>
+      <w:pPr>
+        <w:pStyle w:val="ListParagraph"/>
+        <w:numPr>
+          <w:ilvl w:val="1"/>
+          <w:numId w:val="15"/>
+        </w:numPr>
+      </w:pPr>
+      <w:r>
+        <w:t>Identified experimental limitations and offered guidance to produce usable data for the future experiments</w:t>
+      </w:r>
+    </w:p>
+    <w:p>
+      <w:pPr>
+        <w:pStyle w:val="ListParagraph"/>
+        <w:numPr>
+          <w:ilvl w:val="1"/>
+          <w:numId w:val="15"/>
+        </w:numPr>
+      </w:pPr>
+      <w:r>
+        <w:t xml:space="preserve">Provided framework to produce an in-house transcriptomics workflow to avoid repeated high-cost outsourcing meaning more resources to support additional research </w:t>
+      </w:r>
+    </w:p>
+    <w:p>
+      <w:pPr>
+        <w:pStyle w:val="ListParagraph"/>
+        <w:ind w:left="1440"/>
+      </w:pPr>
+    </w:p>
+    <w:p>
+      <w:pPr>
+        <w:pStyle w:val="ListParagraph"/>
+        <w:ind w:left="1440"/>
+      </w:pPr>
+      <w:r>
+        <w:rPr>
+          <w:u w:val="single"/>
+        </w:rPr>
+        <w:t>Originality</w:t>
+      </w:r>
+      <w:r>
+        <w:t xml:space="preserve"> [this section needs reviewing]</w:t>
+      </w:r>
+    </w:p>
+    <w:p>
+      <w:pPr>
+        <w:pStyle w:val="ListParagraph"/>
+        <w:numPr>
+          <w:ilvl w:val="1"/>
+          <w:numId w:val="15"/>
+        </w:numPr>
+      </w:pPr>
+      <w:r>
+        <w:t>Allergen studies using nebuliser technology build on previous allergen studies using submersion techniques making the analysis relevant</w:t>
+      </w:r>
+    </w:p>
+    <w:p>
+      <w:pPr>
+        <w:pStyle w:val="ListParagraph"/>
+        <w:numPr>
+          <w:ilvl w:val="1"/>
+          <w:numId w:val="15"/>
+        </w:numPr>
+      </w:pPr>
+      <w:r>
+        <w:t>Pathway enrichment analysis of Calu-3 DE miRNAs had not previously been performed. Although it still hasn’t, the workflow is prepared for it.</w:t>
+      </w:r>
+    </w:p>
+    <w:p>
+      <w:pPr>
+        <w:pStyle w:val="ListParagraph"/>
+        <w:numPr>
+          <w:ilvl w:val="1"/>
+          <w:numId w:val="15"/>
+        </w:numPr>
+      </w:pPr>
+      <w:r>
+        <w:t>Other studies have provided overviews of similar open-access workflows e.g., what software to use and full code examples can be found in open-</w:t>
+      </w:r>
+      <w:r>
+        <w:lastRenderedPageBreak/>
+        <w:t>source workflows, but this is often complex. This workflow bridges the gap by providing a simple, reproducible workflow that</w:t>
+      </w:r>
+    </w:p>
+    <w:p>
+      <w:pPr>
+        <w:rPr>
+          <w:b/>
+          <w:bCs/>
+        </w:rPr>
+      </w:pPr>
+    </w:p>
     <w:sectPr>
       <w:pgSz w:w="11906" w:h="16838"/>
       <w:pgMar w:top="1440" w:right="1440" w:bottom="1440" w:left="1440" w:header="708" w:footer="708" w:gutter="0"/>
@@ -3547,6 +3656,95 @@
       </w:pPr>
     </w:lvl>
     <w:lvl w:ilvl="8" w:tplc="0809001B" w:tentative="1">
+      <w:start w:val="1"/>
+      <w:numFmt w:val="lowerRoman"/>
+      <w:lvlText w:val="%9."/>
+      <w:lvlJc w:val="right"/>
+      <w:pPr>
+        <w:ind w:left="6480" w:hanging="180"/>
+      </w:pPr>
+    </w:lvl>
+  </w:abstractNum>
+  <w:abstractNum w:abstractNumId="14" w15:restartNumberingAfterBreak="0">
+    <w:nsid w:val="7B095B35"/>
+    <w:multiLevelType w:val="hybridMultilevel"/>
+    <w:tmpl w:val="1DB64F7C"/>
+    <w:lvl w:ilvl="0" w:tplc="FFFFFFFF">
+      <w:start w:val="1"/>
+      <w:numFmt w:val="decimal"/>
+      <w:lvlText w:val="%1."/>
+      <w:lvlJc w:val="left"/>
+      <w:pPr>
+        <w:ind w:left="720" w:hanging="360"/>
+      </w:pPr>
+      <w:rPr>
+        <w:rFonts w:hint="default"/>
+      </w:rPr>
+    </w:lvl>
+    <w:lvl w:ilvl="1" w:tplc="FFFFFFFF">
+      <w:start w:val="1"/>
+      <w:numFmt w:val="lowerLetter"/>
+      <w:lvlText w:val="%2."/>
+      <w:lvlJc w:val="left"/>
+      <w:pPr>
+        <w:ind w:left="1440" w:hanging="360"/>
+      </w:pPr>
+    </w:lvl>
+    <w:lvl w:ilvl="2" w:tplc="FFFFFFFF">
+      <w:start w:val="1"/>
+      <w:numFmt w:val="lowerRoman"/>
+      <w:lvlText w:val="%3."/>
+      <w:lvlJc w:val="right"/>
+      <w:pPr>
+        <w:ind w:left="2160" w:hanging="180"/>
+      </w:pPr>
+    </w:lvl>
+    <w:lvl w:ilvl="3" w:tplc="FFFFFFFF" w:tentative="1">
+      <w:start w:val="1"/>
+      <w:numFmt w:val="decimal"/>
+      <w:lvlText w:val="%4."/>
+      <w:lvlJc w:val="left"/>
+      <w:pPr>
+        <w:ind w:left="2880" w:hanging="360"/>
+      </w:pPr>
+    </w:lvl>
+    <w:lvl w:ilvl="4" w:tplc="FFFFFFFF" w:tentative="1">
+      <w:start w:val="1"/>
+      <w:numFmt w:val="lowerLetter"/>
+      <w:lvlText w:val="%5."/>
+      <w:lvlJc w:val="left"/>
+      <w:pPr>
+        <w:ind w:left="3600" w:hanging="360"/>
+      </w:pPr>
+    </w:lvl>
+    <w:lvl w:ilvl="5" w:tplc="FFFFFFFF" w:tentative="1">
+      <w:start w:val="1"/>
+      <w:numFmt w:val="lowerRoman"/>
+      <w:lvlText w:val="%6."/>
+      <w:lvlJc w:val="right"/>
+      <w:pPr>
+        <w:ind w:left="4320" w:hanging="180"/>
+      </w:pPr>
+    </w:lvl>
+    <w:lvl w:ilvl="6" w:tplc="FFFFFFFF" w:tentative="1">
+      <w:start w:val="1"/>
+      <w:numFmt w:val="decimal"/>
+      <w:lvlText w:val="%7."/>
+      <w:lvlJc w:val="left"/>
+      <w:pPr>
+        <w:ind w:left="5040" w:hanging="360"/>
+      </w:pPr>
+    </w:lvl>
+    <w:lvl w:ilvl="7" w:tplc="FFFFFFFF" w:tentative="1">
+      <w:start w:val="1"/>
+      <w:numFmt w:val="lowerLetter"/>
+      <w:lvlText w:val="%8."/>
+      <w:lvlJc w:val="left"/>
+      <w:pPr>
+        <w:ind w:left="5760" w:hanging="360"/>
+      </w:pPr>
+    </w:lvl>
+    <w:lvl w:ilvl="8" w:tplc="FFFFFFFF" w:tentative="1">
       <w:start w:val="1"/>
       <w:numFmt w:val="lowerRoman"/>
       <w:lvlText w:val="%9."/>
@@ -3597,6 +3795,9 @@
   </w:num>
   <w:num w:numId="14" w16cid:durableId="1851329029">
     <w:abstractNumId w:val="10"/>
+  </w:num>
+  <w:num w:numId="15" w16cid:durableId="1095856647">
+    <w:abstractNumId w:val="14"/>
   </w:num>
 </w:numbering>
 </file>
@@ -4204,6 +4405,7 @@
   <w:style w:type="character" w:default="1" w:styleId="DefaultParagraphFont">
     <w:name w:val="Default Paragraph Font"/>
     <w:uiPriority w:val="1"/>
+    <w:semiHidden/>
     <w:unhideWhenUsed/>
   </w:style>
   <w:style w:type="table" w:default="1" w:styleId="TableNormal">

</xml_diff>

<commit_message>
ADDING TODAY'S WORK - 06.08.2026
</commit_message>
<xml_diff>
--- a/viva/viva_presentation_plan.docx
+++ b/viva/viva_presentation_plan.docx
@@ -51,15 +51,7 @@
         </w:numPr>
       </w:pPr>
       <w:r>
-        <w:t xml:space="preserve">The talk should end with </w:t>
-      </w:r>
-      <w:proofErr w:type="gramStart"/>
-      <w:r>
-        <w:t>a brief summary</w:t>
-      </w:r>
-      <w:proofErr w:type="gramEnd"/>
-      <w:r>
-        <w:t xml:space="preserve"> of key take-home messages.</w:t>
+        <w:t>The talk should end with a brief summary of key take-home messages.</w:t>
       </w:r>
     </w:p>
     <w:p>
@@ -144,15 +136,7 @@
         </w:numPr>
       </w:pPr>
       <w:r>
-        <w:t xml:space="preserve">Bring backup pdf version in case </w:t>
-      </w:r>
-      <w:proofErr w:type="spellStart"/>
-      <w:r>
-        <w:t>powerpoint</w:t>
-      </w:r>
-      <w:proofErr w:type="spellEnd"/>
-      <w:r>
-        <w:t xml:space="preserve"> does not work for whatever reason</w:t>
+        <w:t>Bring backup pdf version in case powerpoint does not work for whatever reason</w:t>
       </w:r>
     </w:p>
     <w:p>
@@ -164,15 +148,7 @@
         </w:numPr>
       </w:pPr>
       <w:r>
-        <w:t xml:space="preserve">Can test the </w:t>
-      </w:r>
-      <w:proofErr w:type="spellStart"/>
-      <w:r>
-        <w:t>powerpoint</w:t>
-      </w:r>
-      <w:proofErr w:type="spellEnd"/>
-      <w:r>
-        <w:t xml:space="preserve"> in the room before the presentation date</w:t>
+        <w:t>Can test the powerpoint in the room before the presentation date</w:t>
       </w:r>
     </w:p>
     <w:p>
@@ -232,15 +208,7 @@
         </w:numPr>
       </w:pPr>
       <w:r>
-        <w:t xml:space="preserve">Summarise at the end: Finish with key takeaways and invite questions: “In summary, this work shows X, contributes Y, and </w:t>
-      </w:r>
-      <w:proofErr w:type="gramStart"/>
-      <w:r>
-        <w:t>opens up</w:t>
-      </w:r>
-      <w:proofErr w:type="gramEnd"/>
-      <w:r>
-        <w:t xml:space="preserve"> Z. I’m happy to take any questions.”</w:t>
+        <w:t>Summarise at the end: Finish with key takeaways and invite questions: “In summary, this work shows X, contributes Y, and opens up Z. I’m happy to take any questions.”</w:t>
       </w:r>
     </w:p>
     <w:p>
@@ -299,39 +267,7 @@
         </w:numPr>
       </w:pPr>
       <w:r>
-        <w:t xml:space="preserve">Initially, I was going to compare against </w:t>
-      </w:r>
-      <w:proofErr w:type="spellStart"/>
-      <w:r>
-        <w:t>tamirna</w:t>
-      </w:r>
-      <w:proofErr w:type="spellEnd"/>
-      <w:r>
-        <w:t xml:space="preserve"> and </w:t>
-      </w:r>
-      <w:proofErr w:type="spellStart"/>
-      <w:r>
-        <w:t>vicky’s</w:t>
-      </w:r>
-      <w:proofErr w:type="spellEnd"/>
-      <w:r>
-        <w:t xml:space="preserve"> pathway results but didn’t have enough time to do a formal </w:t>
-      </w:r>
-      <w:proofErr w:type="spellStart"/>
-      <w:r>
-        <w:t>compairson</w:t>
-      </w:r>
-      <w:proofErr w:type="spellEnd"/>
-      <w:r>
-        <w:t xml:space="preserve"> against </w:t>
-      </w:r>
-      <w:proofErr w:type="spellStart"/>
-      <w:r>
-        <w:t>tamirna</w:t>
-      </w:r>
-      <w:proofErr w:type="spellEnd"/>
-      <w:r>
-        <w:t xml:space="preserve"> (although did quick check) and it was revealed that Vicky used a proprietary software that didn’t use the same database (although looked for similar pathways e.g., immune-related)</w:t>
+        <w:t>Initially, I was going to compare against tamirna and vicky’s pathway results but didn’t have enough time to do a formal compairson against tamirna (although did quick check) and it was revealed that Vicky used a proprietary software that didn’t use the same database (although looked for similar pathways e.g., immune-related)</w:t>
       </w:r>
     </w:p>
     <w:p>
@@ -358,15 +294,7 @@
         </w:numPr>
       </w:pPr>
       <w:r>
-        <w:t xml:space="preserve">Aim of the work (1) = I wanted to create a pipeline that is user-friendly for non-bioinformaticians because the lab usually </w:t>
-      </w:r>
-      <w:proofErr w:type="gramStart"/>
-      <w:r>
-        <w:t>outsource</w:t>
-      </w:r>
-      <w:proofErr w:type="gramEnd"/>
-      <w:r>
-        <w:t xml:space="preserve"> this work (DE analysis) for a lot of money so I wanted to see whether comparable results could be gained using free software</w:t>
+        <w:t>Aim of the work (1) = I wanted to create a pipeline that is user-friendly for non-bioinformaticians because the lab usually outsource this work (DE analysis) for a lot of money so I wanted to see whether comparable results could be gained using free software</w:t>
       </w:r>
     </w:p>
     <w:p>
@@ -414,15 +342,7 @@
         </w:numPr>
       </w:pPr>
       <w:r>
-        <w:t>Because so much time was spent on developing the methods</w:t>
-      </w:r>
-      <w:proofErr w:type="gramStart"/>
-      <w:r>
-        <w:t xml:space="preserve"> and in particular</w:t>
-      </w:r>
-      <w:proofErr w:type="gramEnd"/>
-      <w:r>
-        <w:t xml:space="preserve"> the pathway analysis, I couldn’t do the above points but given more time I would</w:t>
+        <w:t>Because so much time was spent on developing the methods and in particular the pathway analysis, I couldn’t do the above points but given more time I would</w:t>
       </w:r>
     </w:p>
     <w:p>
@@ -472,6 +392,16 @@
       <w:r>
         <w:t>Add slide numbers</w:t>
       </w:r>
+      <w:r>
+        <w:t xml:space="preserve"> </w:t>
+      </w:r>
+      <w:r>
+        <w:rPr>
+          <w:b/>
+          <w:bCs/>
+        </w:rPr>
+        <w:t>done</w:t>
+      </w:r>
     </w:p>
     <w:p>
       <w:pPr>
@@ -481,13 +411,8 @@
           <w:numId w:val="7"/>
         </w:numPr>
       </w:pPr>
-      <w:proofErr w:type="spellStart"/>
-      <w:r>
-        <w:t>Biorender</w:t>
-      </w:r>
-      <w:proofErr w:type="spellEnd"/>
-      <w:r>
-        <w:t xml:space="preserve"> citation for figure legend: </w:t>
+      <w:r>
+        <w:t xml:space="preserve">Biorender citation for figure legend: </w:t>
       </w:r>
       <w:r>
         <w:t xml:space="preserve">Created in  </w:t>
@@ -1035,6 +960,12 @@
     <w:p>
       <w:pPr>
         <w:pStyle w:val="ListParagraph"/>
+        <w:ind w:left="2160"/>
+      </w:pPr>
+    </w:p>
+    <w:p>
+      <w:pPr>
+        <w:pStyle w:val="ListParagraph"/>
         <w:numPr>
           <w:ilvl w:val="0"/>
           <w:numId w:val="14"/>
@@ -1113,21 +1044,416 @@
         </w:numPr>
       </w:pPr>
       <w:r>
+        <w:t xml:space="preserve">Figure = biorender figure that shows each step </w:t>
+      </w:r>
+      <w:r>
+        <w:t>and</w:t>
+      </w:r>
+      <w:r>
+        <w:t xml:space="preserve"> I can explain each one in more detail</w:t>
+      </w:r>
+    </w:p>
+    <w:p>
+      <w:pPr>
+        <w:pStyle w:val="ListParagraph"/>
+        <w:numPr>
+          <w:ilvl w:val="2"/>
+          <w:numId w:val="14"/>
+        </w:numPr>
+      </w:pPr>
+      <w:r>
+        <w:t>The epithelial barrier as one long line. The different epithelial cells on basal side. Allergens interacting with the apical side of it. EVs produced in response to the allergen. miRNAs visible in the EV as two distinct colours (one for normal, the other for altered). miRNAs interacting and repressing with target genes. Pathways becoming altered.</w:t>
+      </w:r>
+    </w:p>
+    <w:p>
+      <w:pPr>
+        <w:pStyle w:val="ListParagraph"/>
+        <w:ind w:left="1440"/>
+      </w:pPr>
+    </w:p>
+    <w:p>
+      <w:pPr>
+        <w:pStyle w:val="ListParagraph"/>
+        <w:numPr>
+          <w:ilvl w:val="0"/>
+          <w:numId w:val="14"/>
+        </w:numPr>
+      </w:pPr>
+      <w:r>
+        <w:t>Study data</w:t>
+      </w:r>
+      <w:r>
+        <w:t xml:space="preserve"> / experimental design</w:t>
+      </w:r>
+    </w:p>
+    <w:p>
+      <w:pPr>
+        <w:pStyle w:val="ListParagraph"/>
+        <w:numPr>
+          <w:ilvl w:val="1"/>
+          <w:numId w:val="14"/>
+        </w:numPr>
+      </w:pPr>
+      <w:r>
+        <w:t>Biorender figure similar to georgie’s</w:t>
+      </w:r>
+    </w:p>
+    <w:p>
+      <w:pPr>
+        <w:pStyle w:val="ListParagraph"/>
+        <w:numPr>
+          <w:ilvl w:val="2"/>
+          <w:numId w:val="14"/>
+        </w:numPr>
+      </w:pPr>
+      <w:r>
+        <w:t>Cell type</w:t>
+      </w:r>
+    </w:p>
+    <w:p>
+      <w:pPr>
+        <w:pStyle w:val="ListParagraph"/>
+        <w:numPr>
+          <w:ilvl w:val="2"/>
+          <w:numId w:val="14"/>
+        </w:numPr>
+      </w:pPr>
+      <w:r>
+        <w:t>Allergen type / nebuliser</w:t>
+      </w:r>
+    </w:p>
+    <w:p>
+      <w:pPr>
+        <w:pStyle w:val="ListParagraph"/>
+        <w:numPr>
+          <w:ilvl w:val="0"/>
+          <w:numId w:val="14"/>
+        </w:numPr>
+      </w:pPr>
+      <w:r>
+        <w:t>Aims</w:t>
+      </w:r>
+    </w:p>
+    <w:p>
+      <w:pPr>
+        <w:pStyle w:val="ListParagraph"/>
+        <w:numPr>
+          <w:ilvl w:val="1"/>
+          <w:numId w:val="14"/>
+        </w:numPr>
+      </w:pPr>
+      <w:r>
+        <w:t>Produce a transcriptomics workflow to analyse EV-derived miRNA data</w:t>
+      </w:r>
+    </w:p>
+    <w:p>
+      <w:pPr>
+        <w:pStyle w:val="ListParagraph"/>
+        <w:numPr>
+          <w:ilvl w:val="1"/>
+          <w:numId w:val="14"/>
+        </w:numPr>
+      </w:pPr>
+      <w:r>
+        <w:t>Use only open-access software</w:t>
+      </w:r>
+    </w:p>
+    <w:p>
+      <w:pPr>
+        <w:pStyle w:val="ListParagraph"/>
+        <w:numPr>
+          <w:ilvl w:val="1"/>
+          <w:numId w:val="14"/>
+        </w:numPr>
+      </w:pPr>
+      <w:r>
+        <w:t>Use the workflow on Calu-3 dataset</w:t>
+      </w:r>
+    </w:p>
+    <w:p>
+      <w:pPr>
+        <w:pStyle w:val="ListParagraph"/>
+        <w:ind w:left="1440"/>
+      </w:pPr>
+    </w:p>
+    <w:p>
+      <w:pPr>
+        <w:pStyle w:val="ListParagraph"/>
+        <w:numPr>
+          <w:ilvl w:val="0"/>
+          <w:numId w:val="14"/>
+        </w:numPr>
+      </w:pPr>
+      <w:r>
+        <w:t>Bioinformatics w</w:t>
+      </w:r>
+      <w:r>
+        <w:t>orkflow</w:t>
+      </w:r>
+    </w:p>
+    <w:p>
+      <w:pPr>
+        <w:pStyle w:val="ListParagraph"/>
+        <w:numPr>
+          <w:ilvl w:val="1"/>
+          <w:numId w:val="14"/>
+        </w:numPr>
+      </w:pPr>
+      <w:r>
+        <w:t>Trimming -&gt; qc -&gt; mapping -&gt; quantification -&gt; de analysis -&gt; pathway enrichment analysis / literature search</w:t>
+      </w:r>
+    </w:p>
+    <w:p>
+      <w:pPr>
+        <w:pStyle w:val="ListParagraph"/>
+        <w:ind w:left="1440"/>
+      </w:pPr>
+    </w:p>
+    <w:p>
+      <w:pPr>
+        <w:pStyle w:val="ListParagraph"/>
+        <w:numPr>
+          <w:ilvl w:val="0"/>
+          <w:numId w:val="14"/>
+        </w:numPr>
+      </w:pPr>
+      <w:r>
+        <w:t>Findings (1)</w:t>
+      </w:r>
+    </w:p>
+    <w:p>
+      <w:pPr>
+        <w:pStyle w:val="ListParagraph"/>
+        <w:numPr>
+          <w:ilvl w:val="1"/>
+          <w:numId w:val="14"/>
+        </w:numPr>
+      </w:pPr>
+      <w:r>
+        <w:lastRenderedPageBreak/>
+        <w:t>Main point = RNA composition differs in 24 protease compared to rest</w:t>
+      </w:r>
+      <w:r>
+        <w:t xml:space="preserve"> of protease</w:t>
+      </w:r>
+    </w:p>
+    <w:p>
+      <w:pPr>
+        <w:pStyle w:val="ListParagraph"/>
+        <w:numPr>
+          <w:ilvl w:val="1"/>
+          <w:numId w:val="14"/>
+        </w:numPr>
+      </w:pPr>
+      <w:r>
+        <w:t>Main point = very little miRNA in calu-3 dataset</w:t>
+      </w:r>
+    </w:p>
+    <w:p>
+      <w:pPr>
+        <w:pStyle w:val="ListParagraph"/>
+        <w:numPr>
+          <w:ilvl w:val="1"/>
+          <w:numId w:val="14"/>
+        </w:numPr>
+      </w:pPr>
+      <w:r>
+        <w:t>Figure = RNA composition graph for primary and calu-3</w:t>
+      </w:r>
+    </w:p>
+    <w:p>
+      <w:pPr>
+        <w:pStyle w:val="ListParagraph"/>
+        <w:ind w:left="1440"/>
+      </w:pPr>
+    </w:p>
+    <w:p>
+      <w:pPr>
+        <w:pStyle w:val="ListParagraph"/>
+        <w:numPr>
+          <w:ilvl w:val="0"/>
+          <w:numId w:val="14"/>
+        </w:numPr>
+      </w:pPr>
+      <w:r>
+        <w:t>Findings (2)</w:t>
+      </w:r>
+    </w:p>
+    <w:p>
+      <w:pPr>
+        <w:pStyle w:val="ListParagraph"/>
+        <w:numPr>
+          <w:ilvl w:val="1"/>
+          <w:numId w:val="14"/>
+        </w:numPr>
+      </w:pPr>
+      <w:r>
+        <w:t>Main point =</w:t>
+      </w:r>
+      <w:r>
+        <w:t xml:space="preserve"> differential expression highest in 24 protease compared to rest of protease </w:t>
+      </w:r>
+    </w:p>
+    <w:p>
+      <w:pPr>
+        <w:pStyle w:val="ListParagraph"/>
+        <w:numPr>
+          <w:ilvl w:val="1"/>
+          <w:numId w:val="14"/>
+        </w:numPr>
+      </w:pPr>
+      <w:r>
+        <w:t>Main point = limited calu-3 differential expression, even at exploratory FDR threshold</w:t>
+      </w:r>
+    </w:p>
+    <w:p>
+      <w:pPr>
+        <w:pStyle w:val="ListParagraph"/>
+        <w:numPr>
+          <w:ilvl w:val="1"/>
+          <w:numId w:val="14"/>
+        </w:numPr>
+      </w:pPr>
+      <w:r>
+        <w:t>Figure = bar chart of differential expression (have the one extra calu-3 de miRNA in a bright colour to represent the exploratory threshold)</w:t>
+      </w:r>
+    </w:p>
+    <w:p>
+      <w:pPr>
+        <w:pStyle w:val="ListParagraph"/>
+        <w:ind w:left="1440"/>
+      </w:pPr>
+    </w:p>
+    <w:p>
+      <w:pPr>
+        <w:pStyle w:val="ListParagraph"/>
+        <w:numPr>
+          <w:ilvl w:val="0"/>
+          <w:numId w:val="14"/>
+        </w:numPr>
+      </w:pPr>
+      <w:r>
+        <w:t>Findings (3)</w:t>
+      </w:r>
+    </w:p>
+    <w:p>
+      <w:pPr>
+        <w:pStyle w:val="ListParagraph"/>
+        <w:numPr>
+          <w:ilvl w:val="1"/>
+          <w:numId w:val="14"/>
+        </w:numPr>
+      </w:pPr>
+      <w:r>
+        <w:t>Main point =</w:t>
+      </w:r>
+      <w:r>
+        <w:t xml:space="preserve"> target-gene level enrichment provided biologically plausible results for 24 protease</w:t>
+      </w:r>
+    </w:p>
+    <w:p>
+      <w:pPr>
+        <w:pStyle w:val="ListParagraph"/>
+        <w:numPr>
+          <w:ilvl w:val="1"/>
+          <w:numId w:val="14"/>
+        </w:numPr>
+      </w:pPr>
+      <w:r>
+        <w:t xml:space="preserve">Main point = miRNA-level enrichment was not very informative </w:t>
+      </w:r>
+    </w:p>
+    <w:p>
+      <w:pPr>
+        <w:pStyle w:val="ListParagraph"/>
+        <w:numPr>
+          <w:ilvl w:val="1"/>
+          <w:numId w:val="14"/>
+        </w:numPr>
+      </w:pPr>
+      <w:r>
         <w:t xml:space="preserve">Figure = </w:t>
       </w:r>
-      <w:proofErr w:type="spellStart"/>
-      <w:r>
-        <w:t>biorender</w:t>
-      </w:r>
-      <w:proofErr w:type="spellEnd"/>
-      <w:r>
-        <w:t xml:space="preserve"> figure that shows each step </w:t>
-      </w:r>
-      <w:r>
-        <w:t>and</w:t>
-      </w:r>
-      <w:r>
-        <w:t xml:space="preserve"> I can explain each one in more detail</w:t>
+      <w:r>
+        <w:t>dotplot of up- or down-regulated pathways on the left and the miEAA wordplot on the right</w:t>
+      </w:r>
+    </w:p>
+    <w:p>
+      <w:pPr>
+        <w:pStyle w:val="ListParagraph"/>
+        <w:ind w:left="1440"/>
+      </w:pPr>
+    </w:p>
+    <w:p>
+      <w:pPr>
+        <w:pStyle w:val="ListParagraph"/>
+        <w:numPr>
+          <w:ilvl w:val="0"/>
+          <w:numId w:val="14"/>
+        </w:numPr>
+      </w:pPr>
+      <w:r>
+        <w:t>Findings (4)</w:t>
+      </w:r>
+    </w:p>
+    <w:p>
+      <w:pPr>
+        <w:pStyle w:val="ListParagraph"/>
+        <w:numPr>
+          <w:ilvl w:val="1"/>
+          <w:numId w:val="14"/>
+        </w:numPr>
+      </w:pPr>
+      <w:r>
+        <w:t>Main point =</w:t>
+      </w:r>
+      <w:r>
+        <w:t xml:space="preserve"> de miRNAs from Can f 1 in calu-3 dataset have been associated with immune-related pathways though </w:t>
+      </w:r>
+      <w:r>
+        <w:t xml:space="preserve">these may not relate to airway biology (although some do). More support for 125 over 574. </w:t>
+      </w:r>
+    </w:p>
+    <w:p>
+      <w:pPr>
+        <w:pStyle w:val="ListParagraph"/>
+        <w:numPr>
+          <w:ilvl w:val="1"/>
+          <w:numId w:val="14"/>
+        </w:numPr>
+      </w:pPr>
+      <w:r>
+        <w:t>main point = 125 also detected in protease dataset</w:t>
+      </w:r>
+    </w:p>
+    <w:p>
+      <w:pPr>
+        <w:pStyle w:val="ListParagraph"/>
+        <w:numPr>
+          <w:ilvl w:val="1"/>
+          <w:numId w:val="14"/>
+        </w:numPr>
+      </w:pPr>
+      <w:r>
+        <w:t>Figure = pie chart of 125 and 574 with the ratio of publications in each category searched for and the total number of publications very clearly marked above or under the chart</w:t>
+      </w:r>
+    </w:p>
+    <w:p>
+      <w:pPr>
+        <w:pStyle w:val="ListParagraph"/>
+        <w:ind w:left="1440"/>
+      </w:pPr>
+    </w:p>
+    <w:p>
+      <w:pPr>
+        <w:pStyle w:val="ListParagraph"/>
+        <w:numPr>
+          <w:ilvl w:val="0"/>
+          <w:numId w:val="14"/>
+        </w:numPr>
+      </w:pPr>
+      <w:r>
+        <w:t>Interpretation</w:t>
       </w:r>
     </w:p>
     <w:p>
@@ -1139,7 +1465,134 @@
         </w:numPr>
       </w:pPr>
       <w:r>
-        <w:t>The epithelial barrier as one long line. The different epithelial cells on basal side. Allergens interacting with the apical side of it. EVs produced in response to the allergen. miRNAs visible in the EV as two distinct colours (one for normal, the other for altered). miRNAs interacting and repressing with target genes. Pathways becoming altered.</w:t>
+        <w:t>Create transcriptomics workflow using primary HBECs</w:t>
+      </w:r>
+    </w:p>
+    <w:p>
+      <w:pPr>
+        <w:pStyle w:val="ListParagraph"/>
+        <w:numPr>
+          <w:ilvl w:val="1"/>
+          <w:numId w:val="14"/>
+        </w:numPr>
+      </w:pPr>
+      <w:r>
+        <w:t>Immune, inflammatory and epithelial barrier integrity pathways among those enriched which aligns with allergen exposure reaction</w:t>
+      </w:r>
+    </w:p>
+    <w:p>
+      <w:pPr>
+        <w:pStyle w:val="ListParagraph"/>
+        <w:numPr>
+          <w:ilvl w:val="2"/>
+          <w:numId w:val="14"/>
+        </w:numPr>
+      </w:pPr>
+      <w:r>
+        <w:t>Create transcriptomics workflow using primary HBECs</w:t>
+      </w:r>
+    </w:p>
+    <w:p>
+      <w:pPr>
+        <w:pStyle w:val="ListParagraph"/>
+        <w:numPr>
+          <w:ilvl w:val="1"/>
+          <w:numId w:val="14"/>
+        </w:numPr>
+      </w:pPr>
+      <w:r>
+        <w:t>miRNA-level enrichment much more limited, potentially due to smaller databases and miRNA-pathway associations, potentially due to background miRNAs/ranking order/miRNAs observed. These are normally complementary methods not one-or-the-other.</w:t>
+      </w:r>
+    </w:p>
+    <w:p>
+      <w:pPr>
+        <w:pStyle w:val="ListParagraph"/>
+        <w:numPr>
+          <w:ilvl w:val="2"/>
+          <w:numId w:val="14"/>
+        </w:numPr>
+      </w:pPr>
+      <w:r>
+        <w:t>Apply the workflow to the Calu-3 dataset</w:t>
+      </w:r>
+    </w:p>
+    <w:p>
+      <w:pPr>
+        <w:pStyle w:val="ListParagraph"/>
+        <w:numPr>
+          <w:ilvl w:val="1"/>
+          <w:numId w:val="14"/>
+        </w:numPr>
+      </w:pPr>
+      <w:r>
+        <w:t xml:space="preserve">Established role of miR-125b-5p in immune biology but potentially not fully established in airway yet – though presence in respiratory diseases </w:t>
+      </w:r>
+      <w:r>
+        <w:lastRenderedPageBreak/>
+        <w:t>was found. Not much evidence for the role of miR</w:t>
+      </w:r>
+      <w:r>
+        <w:t>-</w:t>
+      </w:r>
+      <w:r>
+        <w:t>574-5p so this may be more novel or may not represent a genuine association – emerging role in immune response</w:t>
+      </w:r>
+      <w:r>
+        <w:t xml:space="preserve"> (</w:t>
+      </w:r>
+      <w:r>
+        <w:t>TLR7/8 signalling</w:t>
+      </w:r>
+      <w:r>
+        <w:t>)</w:t>
+      </w:r>
+      <w:r>
+        <w:t xml:space="preserve"> with some recent papers</w:t>
+      </w:r>
+      <w:r>
+        <w:t xml:space="preserve">. </w:t>
+      </w:r>
+      <w:r>
+        <w:t>miR-125b-5p also appeared in the dose 24 protease samples</w:t>
+      </w:r>
+      <w:r>
+        <w:t xml:space="preserve"> </w:t>
+      </w:r>
+    </w:p>
+    <w:p>
+      <w:pPr>
+        <w:pStyle w:val="ListParagraph"/>
+        <w:numPr>
+          <w:ilvl w:val="2"/>
+          <w:numId w:val="14"/>
+        </w:numPr>
+      </w:pPr>
+      <w:r>
+        <w:t>Additional finding</w:t>
+      </w:r>
+    </w:p>
+    <w:p>
+      <w:pPr>
+        <w:pStyle w:val="ListParagraph"/>
+        <w:numPr>
+          <w:ilvl w:val="1"/>
+          <w:numId w:val="14"/>
+        </w:numPr>
+      </w:pPr>
+      <w:r>
+        <w:t>D</w:t>
+      </w:r>
+      <w:r>
+        <w:t xml:space="preserve">ifferent RNA profile in protease dose 24 samples </w:t>
+      </w:r>
+      <w:r>
+        <w:t>suggest</w:t>
+      </w:r>
+      <w:r>
+        <w:t xml:space="preserve"> allergen exposure </w:t>
+      </w:r>
+      <w:r>
+        <w:t>has broader effects than just on the miRNA</w:t>
       </w:r>
     </w:p>
     <w:p>
@@ -1157,475 +1610,177 @@
         </w:numPr>
       </w:pPr>
       <w:r>
-        <w:t>Study data</w:t>
-      </w:r>
-      <w:r>
-        <w:t xml:space="preserve"> / experimental design</w:t>
-      </w:r>
-    </w:p>
-    <w:p>
-      <w:pPr>
-        <w:pStyle w:val="ListParagraph"/>
-        <w:numPr>
-          <w:ilvl w:val="1"/>
-          <w:numId w:val="14"/>
-        </w:numPr>
-      </w:pPr>
-      <w:proofErr w:type="spellStart"/>
-      <w:r>
-        <w:t>Biorender</w:t>
-      </w:r>
-      <w:proofErr w:type="spellEnd"/>
-      <w:r>
-        <w:t xml:space="preserve"> figure </w:t>
-      </w:r>
-      <w:proofErr w:type="gramStart"/>
-      <w:r>
-        <w:t>similar to</w:t>
-      </w:r>
-      <w:proofErr w:type="gramEnd"/>
+        <w:t>Workflow l</w:t>
+      </w:r>
+      <w:r>
+        <w:t>imitations / robustness of findings</w:t>
+      </w:r>
+      <w:r>
+        <w:t xml:space="preserve"> [e.g., including strengths?]</w:t>
+      </w:r>
+    </w:p>
+    <w:p>
+      <w:pPr>
+        <w:pStyle w:val="ListParagraph"/>
+        <w:numPr>
+          <w:ilvl w:val="1"/>
+          <w:numId w:val="14"/>
+        </w:numPr>
+      </w:pPr>
+      <w:r>
+        <w:t>Didn’t use alternate pathway enrichment methods e.g., network-based enrichment to focus pathway enrichment on key regulatory genes</w:t>
+      </w:r>
+    </w:p>
+    <w:p>
+      <w:pPr>
+        <w:pStyle w:val="ListParagraph"/>
+        <w:numPr>
+          <w:ilvl w:val="1"/>
+          <w:numId w:val="14"/>
+        </w:numPr>
+      </w:pPr>
+      <w:r>
+        <w:t xml:space="preserve">Target-gene pathway enrichment analysis constrained by lack of context-dependent filtering which was hard to integrate </w:t>
+      </w:r>
+    </w:p>
+    <w:p>
+      <w:pPr>
+        <w:pStyle w:val="ListParagraph"/>
+        <w:numPr>
+          <w:ilvl w:val="1"/>
+          <w:numId w:val="14"/>
+        </w:numPr>
+      </w:pPr>
+      <w:r>
+        <w:t>Couldn’t remove outlier samples identified as distant through PCA or lacking concordance in expression levels due to only 3 biological replicates</w:t>
+      </w:r>
+    </w:p>
+    <w:p>
+      <w:pPr>
+        <w:pStyle w:val="ListParagraph"/>
+        <w:numPr>
+          <w:ilvl w:val="1"/>
+          <w:numId w:val="14"/>
+        </w:numPr>
+      </w:pPr>
+      <w:r>
+        <w:t>Robustness of Calu-3 results majorly compromised due to low miRNA abundance, with no more than 5000 miRNA molecules identified in any sample</w:t>
+      </w:r>
+    </w:p>
+    <w:p>
+      <w:pPr>
+        <w:pStyle w:val="ListParagraph"/>
+        <w:numPr>
+          <w:ilvl w:val="1"/>
+          <w:numId w:val="14"/>
+        </w:numPr>
+      </w:pPr>
+      <w:r>
+        <w:t>[strengths: experimentally validated targets, …]</w:t>
+      </w:r>
+    </w:p>
+    <w:p>
+      <w:pPr>
+        <w:pStyle w:val="ListParagraph"/>
+        <w:ind w:left="1440"/>
+      </w:pPr>
+    </w:p>
+    <w:p>
+      <w:pPr>
+        <w:pStyle w:val="ListParagraph"/>
+        <w:numPr>
+          <w:ilvl w:val="0"/>
+          <w:numId w:val="14"/>
+        </w:numPr>
+      </w:pPr>
+      <w:r>
+        <w:t>Experimental Design Optimisations</w:t>
+      </w:r>
+    </w:p>
+    <w:p>
+      <w:pPr>
+        <w:pStyle w:val="ListParagraph"/>
+        <w:numPr>
+          <w:ilvl w:val="1"/>
+          <w:numId w:val="14"/>
+        </w:numPr>
+      </w:pPr>
+      <w:r>
+        <w:t>Main point = experimental optimisations to enable robust analysis of future calu-3 datasets</w:t>
+      </w:r>
+    </w:p>
+    <w:p>
+      <w:pPr>
+        <w:pStyle w:val="ListParagraph"/>
+        <w:numPr>
+          <w:ilvl w:val="1"/>
+          <w:numId w:val="14"/>
+        </w:numPr>
+      </w:pPr>
+      <w:r>
+        <w:t>Figure = instead of a list of points make a biorender figure with each point associated with an image (this will increase engagement)</w:t>
+      </w:r>
+    </w:p>
+    <w:p>
+      <w:pPr>
+        <w:pStyle w:val="ListParagraph"/>
+        <w:numPr>
+          <w:ilvl w:val="1"/>
+          <w:numId w:val="14"/>
+        </w:numPr>
+      </w:pPr>
+      <w:r>
+        <w:t>Increase sample size</w:t>
+      </w:r>
+    </w:p>
+    <w:p>
+      <w:pPr>
+        <w:pStyle w:val="ListParagraph"/>
+        <w:numPr>
+          <w:ilvl w:val="1"/>
+          <w:numId w:val="14"/>
+        </w:numPr>
+      </w:pPr>
+      <w:r>
+        <w:t xml:space="preserve">Increase the amount of EVs collected to increase the amount of miRNA to analyse </w:t>
+      </w:r>
+    </w:p>
+    <w:p>
+      <w:pPr>
+        <w:pStyle w:val="ListParagraph"/>
+        <w:numPr>
+          <w:ilvl w:val="1"/>
+          <w:numId w:val="14"/>
+        </w:numPr>
+      </w:pPr>
+      <w:r>
+        <w:t xml:space="preserve">Integrate matched miRNA-mRNA </w:t>
+      </w:r>
+    </w:p>
+    <w:p>
+      <w:pPr>
+        <w:pStyle w:val="ListParagraph"/>
+      </w:pPr>
+    </w:p>
+    <w:p>
+      <w:pPr>
+        <w:pStyle w:val="ListParagraph"/>
+        <w:ind w:left="2160"/>
+      </w:pPr>
+    </w:p>
+    <w:p>
+      <w:pPr>
+        <w:pStyle w:val="ListParagraph"/>
+        <w:numPr>
+          <w:ilvl w:val="0"/>
+          <w:numId w:val="14"/>
+        </w:numPr>
+      </w:pPr>
+      <w:r>
+        <w:t>Significance / originality</w:t>
+      </w:r>
       <w:r>
         <w:t xml:space="preserve"> </w:t>
-      </w:r>
-      <w:proofErr w:type="spellStart"/>
-      <w:r>
-        <w:t>georgie’s</w:t>
-      </w:r>
-      <w:proofErr w:type="spellEnd"/>
-    </w:p>
-    <w:p>
-      <w:pPr>
-        <w:pStyle w:val="ListParagraph"/>
-        <w:numPr>
-          <w:ilvl w:val="2"/>
-          <w:numId w:val="14"/>
-        </w:numPr>
-      </w:pPr>
-      <w:r>
-        <w:t>Cell type</w:t>
-      </w:r>
-    </w:p>
-    <w:p>
-      <w:pPr>
-        <w:pStyle w:val="ListParagraph"/>
-        <w:numPr>
-          <w:ilvl w:val="2"/>
-          <w:numId w:val="14"/>
-        </w:numPr>
-      </w:pPr>
-      <w:r>
-        <w:t>Allergen type / nebuliser</w:t>
-      </w:r>
-    </w:p>
-    <w:p>
-      <w:pPr>
-        <w:pStyle w:val="ListParagraph"/>
-        <w:numPr>
-          <w:ilvl w:val="2"/>
-          <w:numId w:val="14"/>
-        </w:numPr>
-      </w:pPr>
-    </w:p>
-    <w:p>
-      <w:pPr>
-        <w:pStyle w:val="ListParagraph"/>
-        <w:numPr>
-          <w:ilvl w:val="0"/>
-          <w:numId w:val="14"/>
-        </w:numPr>
-      </w:pPr>
-      <w:r>
-        <w:t>Bioinformatics w</w:t>
-      </w:r>
-      <w:r>
-        <w:t>orkflow</w:t>
-      </w:r>
-    </w:p>
-    <w:p>
-      <w:pPr>
-        <w:pStyle w:val="ListParagraph"/>
-        <w:numPr>
-          <w:ilvl w:val="1"/>
-          <w:numId w:val="14"/>
-        </w:numPr>
-      </w:pPr>
-      <w:r>
-        <w:t>Trimming -&gt; qc -&gt; mapping -&gt; quantification -&gt; de analysis -&gt; pathway enrichment analysis / literature search</w:t>
-      </w:r>
-      <w:r>
-        <w:rPr>
-          <w:rFonts w:ascii="Aptos" w:hAnsi="Aptos"/>
-        </w:rPr>
-        <w:t>µ</w:t>
-      </w:r>
-    </w:p>
-    <w:p>
-      <w:pPr>
-        <w:pStyle w:val="ListParagraph"/>
-        <w:numPr>
-          <w:ilvl w:val="0"/>
-          <w:numId w:val="14"/>
-        </w:numPr>
-      </w:pPr>
-      <w:r>
-        <w:t>Findings (1)</w:t>
-      </w:r>
-    </w:p>
-    <w:p>
-      <w:pPr>
-        <w:pStyle w:val="ListParagraph"/>
-        <w:numPr>
-          <w:ilvl w:val="1"/>
-          <w:numId w:val="14"/>
-        </w:numPr>
-      </w:pPr>
-      <w:r>
-        <w:t xml:space="preserve">Main point = RNA composition differs in 24 </w:t>
-      </w:r>
-      <w:proofErr w:type="gramStart"/>
-      <w:r>
-        <w:t>protease</w:t>
-      </w:r>
-      <w:proofErr w:type="gramEnd"/>
-      <w:r>
-        <w:t xml:space="preserve"> compared to rest</w:t>
-      </w:r>
-      <w:r>
-        <w:t xml:space="preserve"> of protease</w:t>
-      </w:r>
-    </w:p>
-    <w:p>
-      <w:pPr>
-        <w:pStyle w:val="ListParagraph"/>
-        <w:numPr>
-          <w:ilvl w:val="1"/>
-          <w:numId w:val="14"/>
-        </w:numPr>
-      </w:pPr>
-      <w:r>
-        <w:t>Main point = very little miRNA in calu-3 dataset</w:t>
-      </w:r>
-    </w:p>
-    <w:p>
-      <w:pPr>
-        <w:pStyle w:val="ListParagraph"/>
-        <w:numPr>
-          <w:ilvl w:val="1"/>
-          <w:numId w:val="14"/>
-        </w:numPr>
-      </w:pPr>
-      <w:r>
-        <w:t>Figure = RNA composition graph for primary and calu-3</w:t>
-      </w:r>
-    </w:p>
-    <w:p>
-      <w:pPr>
-        <w:pStyle w:val="ListParagraph"/>
-        <w:numPr>
-          <w:ilvl w:val="0"/>
-          <w:numId w:val="14"/>
-        </w:numPr>
-      </w:pPr>
-      <w:r>
-        <w:t>Findings (2)</w:t>
-      </w:r>
-    </w:p>
-    <w:p>
-      <w:pPr>
-        <w:pStyle w:val="ListParagraph"/>
-        <w:numPr>
-          <w:ilvl w:val="1"/>
-          <w:numId w:val="14"/>
-        </w:numPr>
-      </w:pPr>
-      <w:r>
-        <w:lastRenderedPageBreak/>
-        <w:t>Main point =</w:t>
-      </w:r>
-      <w:r>
-        <w:t xml:space="preserve"> differential expression highest in 24 </w:t>
-      </w:r>
-      <w:proofErr w:type="gramStart"/>
-      <w:r>
-        <w:t>protease</w:t>
-      </w:r>
-      <w:proofErr w:type="gramEnd"/>
-      <w:r>
-        <w:t xml:space="preserve"> compared to rest of protease </w:t>
-      </w:r>
-    </w:p>
-    <w:p>
-      <w:pPr>
-        <w:pStyle w:val="ListParagraph"/>
-        <w:numPr>
-          <w:ilvl w:val="1"/>
-          <w:numId w:val="14"/>
-        </w:numPr>
-      </w:pPr>
-      <w:r>
-        <w:t>Main point = limited calu-3 differential expression, even at exploratory FDR threshold</w:t>
-      </w:r>
-    </w:p>
-    <w:p>
-      <w:pPr>
-        <w:pStyle w:val="ListParagraph"/>
-        <w:numPr>
-          <w:ilvl w:val="1"/>
-          <w:numId w:val="14"/>
-        </w:numPr>
-      </w:pPr>
-      <w:r>
-        <w:t>Figure = bar chart of differential expression (have the one extra calu-3 de miRNA in a bright colour to represent the exploratory threshold)</w:t>
-      </w:r>
-    </w:p>
-    <w:p>
-      <w:pPr>
-        <w:pStyle w:val="ListParagraph"/>
-        <w:numPr>
-          <w:ilvl w:val="0"/>
-          <w:numId w:val="14"/>
-        </w:numPr>
-      </w:pPr>
-      <w:r>
-        <w:t>Findings (3)</w:t>
-      </w:r>
-    </w:p>
-    <w:p>
-      <w:pPr>
-        <w:pStyle w:val="ListParagraph"/>
-        <w:numPr>
-          <w:ilvl w:val="1"/>
-          <w:numId w:val="14"/>
-        </w:numPr>
-      </w:pPr>
-      <w:r>
-        <w:t>Main point =</w:t>
-      </w:r>
-      <w:r>
-        <w:t xml:space="preserve"> target-gene level enrichment provided biologically plausible results for 24 </w:t>
-      </w:r>
-      <w:proofErr w:type="gramStart"/>
-      <w:r>
-        <w:t>protease</w:t>
-      </w:r>
-      <w:proofErr w:type="gramEnd"/>
-    </w:p>
-    <w:p>
-      <w:pPr>
-        <w:pStyle w:val="ListParagraph"/>
-        <w:numPr>
-          <w:ilvl w:val="1"/>
-          <w:numId w:val="14"/>
-        </w:numPr>
-      </w:pPr>
-      <w:r>
-        <w:t xml:space="preserve">Main point = miRNA-level enrichment was not very informative </w:t>
-      </w:r>
-    </w:p>
-    <w:p>
-      <w:pPr>
-        <w:pStyle w:val="ListParagraph"/>
-        <w:numPr>
-          <w:ilvl w:val="1"/>
-          <w:numId w:val="14"/>
-        </w:numPr>
-      </w:pPr>
-      <w:r>
-        <w:t xml:space="preserve">Figure = </w:t>
-      </w:r>
-      <w:proofErr w:type="spellStart"/>
-      <w:r>
-        <w:t>dotplot</w:t>
-      </w:r>
-      <w:proofErr w:type="spellEnd"/>
-      <w:r>
-        <w:t xml:space="preserve"> of up- or down-regulated pathways on the left and the </w:t>
-      </w:r>
-      <w:proofErr w:type="spellStart"/>
-      <w:r>
-        <w:t>miEAA</w:t>
-      </w:r>
-      <w:proofErr w:type="spellEnd"/>
-      <w:r>
-        <w:t xml:space="preserve"> </w:t>
-      </w:r>
-      <w:proofErr w:type="spellStart"/>
-      <w:r>
-        <w:t>wordplot</w:t>
-      </w:r>
-      <w:proofErr w:type="spellEnd"/>
-      <w:r>
-        <w:t xml:space="preserve"> on the right</w:t>
-      </w:r>
-    </w:p>
-    <w:p>
-      <w:pPr>
-        <w:pStyle w:val="ListParagraph"/>
-        <w:numPr>
-          <w:ilvl w:val="0"/>
-          <w:numId w:val="14"/>
-        </w:numPr>
-      </w:pPr>
-      <w:r>
-        <w:t>Findings (4)</w:t>
-      </w:r>
-    </w:p>
-    <w:p>
-      <w:pPr>
-        <w:pStyle w:val="ListParagraph"/>
-        <w:numPr>
-          <w:ilvl w:val="1"/>
-          <w:numId w:val="14"/>
-        </w:numPr>
-      </w:pPr>
-      <w:r>
-        <w:t>Main point =</w:t>
-      </w:r>
-      <w:r>
-        <w:t xml:space="preserve"> de miRNAs from Can f 1 in calu-3 dataset have been associated with immune-related pathways though </w:t>
-      </w:r>
-      <w:r>
-        <w:t xml:space="preserve">these may not relate to airway biology (although some do). More support for 125 over 574. </w:t>
-      </w:r>
-    </w:p>
-    <w:p>
-      <w:pPr>
-        <w:pStyle w:val="ListParagraph"/>
-        <w:numPr>
-          <w:ilvl w:val="1"/>
-          <w:numId w:val="14"/>
-        </w:numPr>
-      </w:pPr>
-      <w:r>
-        <w:t>main point = 125 also detected in protease dataset</w:t>
-      </w:r>
-    </w:p>
-    <w:p>
-      <w:pPr>
-        <w:pStyle w:val="ListParagraph"/>
-        <w:numPr>
-          <w:ilvl w:val="1"/>
-          <w:numId w:val="14"/>
-        </w:numPr>
-      </w:pPr>
-      <w:r>
-        <w:t>Figure = pie chart of 125 and 574 with the ratio of publications in each category searched for and the total number of publications very clearly marked above or under the chart</w:t>
-      </w:r>
-    </w:p>
-    <w:p>
-      <w:pPr>
-        <w:pStyle w:val="ListParagraph"/>
-        <w:numPr>
-          <w:ilvl w:val="0"/>
-          <w:numId w:val="14"/>
-        </w:numPr>
-      </w:pPr>
-      <w:r>
-        <w:t>Findings (5)</w:t>
-      </w:r>
-      <w:r>
-        <w:t xml:space="preserve"> [move this section to after discussion of findings?]</w:t>
-      </w:r>
-    </w:p>
-    <w:p>
-      <w:pPr>
-        <w:pStyle w:val="ListParagraph"/>
-        <w:numPr>
-          <w:ilvl w:val="1"/>
-          <w:numId w:val="14"/>
-        </w:numPr>
-      </w:pPr>
-      <w:r>
-        <w:t>Main point = experimental optimisations to enable robust analysis of future calu-3 datasets</w:t>
-      </w:r>
-    </w:p>
-    <w:p>
-      <w:pPr>
-        <w:pStyle w:val="ListParagraph"/>
-        <w:numPr>
-          <w:ilvl w:val="1"/>
-          <w:numId w:val="14"/>
-        </w:numPr>
-      </w:pPr>
-      <w:r>
-        <w:t xml:space="preserve">Figure = instead of a list of points make a </w:t>
-      </w:r>
-      <w:proofErr w:type="spellStart"/>
-      <w:r>
-        <w:t>biorender</w:t>
-      </w:r>
-      <w:proofErr w:type="spellEnd"/>
-      <w:r>
-        <w:t xml:space="preserve"> figure with each point associated with an image (this will increase engagement)</w:t>
-      </w:r>
-    </w:p>
-    <w:p>
-      <w:pPr>
-        <w:pStyle w:val="ListParagraph"/>
-        <w:numPr>
-          <w:ilvl w:val="2"/>
-          <w:numId w:val="14"/>
-        </w:numPr>
-      </w:pPr>
-      <w:r>
-        <w:t>Increase sample size</w:t>
-      </w:r>
-    </w:p>
-    <w:p>
-      <w:pPr>
-        <w:pStyle w:val="ListParagraph"/>
-        <w:numPr>
-          <w:ilvl w:val="2"/>
-          <w:numId w:val="14"/>
-        </w:numPr>
-      </w:pPr>
-      <w:r>
-        <w:t xml:space="preserve">Increase the amount of EVs collected to increase the amount of miRNA to analyse </w:t>
-      </w:r>
-    </w:p>
-    <w:p>
-      <w:pPr>
-        <w:pStyle w:val="ListParagraph"/>
-        <w:numPr>
-          <w:ilvl w:val="2"/>
-          <w:numId w:val="14"/>
-        </w:numPr>
-      </w:pPr>
-      <w:r>
-        <w:t xml:space="preserve">Integrate matched miRNA-mRNA </w:t>
-      </w:r>
-    </w:p>
-    <w:p>
-      <w:pPr>
-        <w:pStyle w:val="ListParagraph"/>
-        <w:ind w:left="2160"/>
-      </w:pPr>
-    </w:p>
-    <w:p>
-      <w:pPr>
-        <w:pStyle w:val="ListParagraph"/>
-        <w:numPr>
-          <w:ilvl w:val="0"/>
-          <w:numId w:val="14"/>
-        </w:numPr>
-      </w:pPr>
-      <w:r>
-        <w:t>Significance / originality</w:t>
-      </w:r>
-      <w:r>
-        <w:t xml:space="preserve"> [is</w:t>
-      </w:r>
-      <w:r>
-        <w:t xml:space="preserve"> this</w:t>
-      </w:r>
-      <w:r>
-        <w:t xml:space="preserve"> discussion</w:t>
-      </w:r>
-      <w:r>
-        <w:t>?</w:t>
-      </w:r>
-      <w:r>
-        <w:t>]</w:t>
       </w:r>
     </w:p>
     <w:p>
@@ -1649,8 +1804,41 @@
         </w:numPr>
       </w:pPr>
       <w:r>
-        <w:t>[]</w:t>
-      </w:r>
+        <w:t>Identified limitations of a dataset intended for publication which may contain unsupported findings</w:t>
+      </w:r>
+      <w:r>
+        <w:t xml:space="preserve"> </w:t>
+      </w:r>
+    </w:p>
+    <w:p>
+      <w:pPr>
+        <w:pStyle w:val="ListParagraph"/>
+        <w:numPr>
+          <w:ilvl w:val="1"/>
+          <w:numId w:val="14"/>
+        </w:numPr>
+      </w:pPr>
+      <w:r>
+        <w:t>Identified experimental limitations and offered guidance to produce usable data for the future experiments</w:t>
+      </w:r>
+    </w:p>
+    <w:p>
+      <w:pPr>
+        <w:pStyle w:val="ListParagraph"/>
+        <w:numPr>
+          <w:ilvl w:val="1"/>
+          <w:numId w:val="14"/>
+        </w:numPr>
+      </w:pPr>
+      <w:r>
+        <w:t xml:space="preserve">Provided framework to produce an in-house transcriptomics workflow to avoid repeated high-cost outsourcing meaning more resources to support additional research </w:t>
+      </w:r>
+    </w:p>
+    <w:p>
+      <w:pPr>
+        <w:pStyle w:val="ListParagraph"/>
+        <w:ind w:left="1440"/>
+      </w:pPr>
     </w:p>
     <w:p>
       <w:pPr>
@@ -1677,13 +1865,43 @@
       <w:pPr>
         <w:pStyle w:val="ListParagraph"/>
         <w:numPr>
-          <w:ilvl w:val="1"/>
-          <w:numId w:val="14"/>
-        </w:numPr>
-      </w:pPr>
-      <w:r>
-        <w:t>[]</w:t>
-      </w:r>
+          <w:ilvl w:val="0"/>
+          <w:numId w:val="16"/>
+        </w:numPr>
+      </w:pPr>
+      <w:r>
+        <w:t>Allergen studies using nebuliser technology build on previous allergen studies using submersion techniques making the analysis relevant</w:t>
+      </w:r>
+    </w:p>
+    <w:p>
+      <w:pPr>
+        <w:pStyle w:val="ListParagraph"/>
+        <w:numPr>
+          <w:ilvl w:val="0"/>
+          <w:numId w:val="16"/>
+        </w:numPr>
+      </w:pPr>
+      <w:r>
+        <w:t>Pathway enrichment analysis of Calu-3 DE miRNAs had not previously been performed. Although it still hasn’t, the workflow is prepared for it.</w:t>
+      </w:r>
+    </w:p>
+    <w:p>
+      <w:pPr>
+        <w:pStyle w:val="ListParagraph"/>
+        <w:numPr>
+          <w:ilvl w:val="0"/>
+          <w:numId w:val="16"/>
+        </w:numPr>
+      </w:pPr>
+      <w:r>
+        <w:t>Other studies have provided overviews of similar open-access workflows e.g., what software to use and full code examples can be found in open-source workflows, but this is often complex. This workflow bridges the gap by providing a simple, reproducible workflow that…</w:t>
+      </w:r>
+    </w:p>
+    <w:p>
+      <w:pPr>
+        <w:pStyle w:val="ListParagraph"/>
+        <w:ind w:left="1440"/>
+      </w:pPr>
       <w:r>
         <w:t xml:space="preserve"> </w:t>
       </w:r>
@@ -1691,26 +1909,7 @@
     <w:p>
       <w:pPr>
         <w:pStyle w:val="ListParagraph"/>
-        <w:numPr>
-          <w:ilvl w:val="0"/>
-          <w:numId w:val="14"/>
-        </w:numPr>
-      </w:pPr>
-      <w:r>
-        <w:t>Limitations / robustness of findings</w:t>
-      </w:r>
-    </w:p>
-    <w:p>
-      <w:pPr>
-        <w:pStyle w:val="ListParagraph"/>
-        <w:numPr>
-          <w:ilvl w:val="1"/>
-          <w:numId w:val="14"/>
-        </w:numPr>
-      </w:pPr>
-      <w:r>
-        <w:t xml:space="preserve">Target-gene pathway enrichment analysis constrained by lack of context-dependent filtering which was hard to integrate </w:t>
-      </w:r>
+      </w:pPr>
     </w:p>
     <w:p>
       <w:pPr>
@@ -1733,19 +1932,6 @@
         </w:numPr>
       </w:pPr>
       <w:r>
-        <w:lastRenderedPageBreak/>
-        <w:t>Investigate alternate pathway enrichment methods e.g., network-based enrichment</w:t>
-      </w:r>
-    </w:p>
-    <w:p>
-      <w:pPr>
-        <w:pStyle w:val="ListParagraph"/>
-        <w:numPr>
-          <w:ilvl w:val="1"/>
-          <w:numId w:val="14"/>
-        </w:numPr>
-      </w:pPr>
-      <w:r>
         <w:t xml:space="preserve">Validate </w:t>
       </w:r>
       <w:r>
@@ -1806,6 +1992,12 @@
     <w:p>
       <w:pPr>
         <w:pStyle w:val="ListParagraph"/>
+        <w:ind w:left="1440"/>
+      </w:pPr>
+    </w:p>
+    <w:p>
+      <w:pPr>
+        <w:pStyle w:val="ListParagraph"/>
         <w:numPr>
           <w:ilvl w:val="0"/>
           <w:numId w:val="14"/>
@@ -1874,6 +2066,12 @@
       <w:r>
         <w:t>Set the foundation for creating an open-access workflow suitable to be performed by non-bioinformaticians at minimal cost</w:t>
       </w:r>
+    </w:p>
+    <w:p>
+      <w:pPr>
+        <w:pStyle w:val="ListParagraph"/>
+        <w:ind w:left="1440"/>
+      </w:pPr>
     </w:p>
     <w:p>
       <w:pPr>
@@ -1907,127 +2105,6 @@
           <w:szCs w:val="36"/>
         </w:rPr>
         <w:t>Archive</w:t>
-      </w:r>
-    </w:p>
-    <w:p>
-      <w:pPr>
-        <w:pStyle w:val="ListParagraph"/>
-        <w:numPr>
-          <w:ilvl w:val="0"/>
-          <w:numId w:val="15"/>
-        </w:numPr>
-      </w:pPr>
-      <w:r>
-        <w:t>Significance / originality</w:t>
-      </w:r>
-    </w:p>
-    <w:p>
-      <w:pPr>
-        <w:pStyle w:val="ListParagraph"/>
-        <w:ind w:left="1440"/>
-      </w:pPr>
-      <w:r>
-        <w:rPr>
-          <w:u w:val="single"/>
-        </w:rPr>
-        <w:t>Significance</w:t>
-      </w:r>
-    </w:p>
-    <w:p>
-      <w:pPr>
-        <w:pStyle w:val="ListParagraph"/>
-        <w:numPr>
-          <w:ilvl w:val="1"/>
-          <w:numId w:val="15"/>
-        </w:numPr>
-      </w:pPr>
-      <w:r>
-        <w:t>Identified limitations of a dataset intended for publication which may contain unsupported findings</w:t>
-      </w:r>
-    </w:p>
-    <w:p>
-      <w:pPr>
-        <w:pStyle w:val="ListParagraph"/>
-        <w:numPr>
-          <w:ilvl w:val="1"/>
-          <w:numId w:val="15"/>
-        </w:numPr>
-      </w:pPr>
-      <w:r>
-        <w:t>Identified experimental limitations and offered guidance to produce usable data for the future experiments</w:t>
-      </w:r>
-    </w:p>
-    <w:p>
-      <w:pPr>
-        <w:pStyle w:val="ListParagraph"/>
-        <w:numPr>
-          <w:ilvl w:val="1"/>
-          <w:numId w:val="15"/>
-        </w:numPr>
-      </w:pPr>
-      <w:r>
-        <w:t xml:space="preserve">Provided framework to produce an in-house transcriptomics workflow to avoid repeated high-cost outsourcing meaning more resources to support additional research </w:t>
-      </w:r>
-    </w:p>
-    <w:p>
-      <w:pPr>
-        <w:pStyle w:val="ListParagraph"/>
-        <w:ind w:left="1440"/>
-      </w:pPr>
-    </w:p>
-    <w:p>
-      <w:pPr>
-        <w:pStyle w:val="ListParagraph"/>
-        <w:ind w:left="1440"/>
-      </w:pPr>
-      <w:r>
-        <w:rPr>
-          <w:u w:val="single"/>
-        </w:rPr>
-        <w:t>Originality</w:t>
-      </w:r>
-      <w:r>
-        <w:t xml:space="preserve"> [this section needs reviewing]</w:t>
-      </w:r>
-    </w:p>
-    <w:p>
-      <w:pPr>
-        <w:pStyle w:val="ListParagraph"/>
-        <w:numPr>
-          <w:ilvl w:val="1"/>
-          <w:numId w:val="15"/>
-        </w:numPr>
-      </w:pPr>
-      <w:r>
-        <w:t>Allergen studies using nebuliser technology build on previous allergen studies using submersion techniques making the analysis relevant</w:t>
-      </w:r>
-    </w:p>
-    <w:p>
-      <w:pPr>
-        <w:pStyle w:val="ListParagraph"/>
-        <w:numPr>
-          <w:ilvl w:val="1"/>
-          <w:numId w:val="15"/>
-        </w:numPr>
-      </w:pPr>
-      <w:r>
-        <w:t>Pathway enrichment analysis of Calu-3 DE miRNAs had not previously been performed. Although it still hasn’t, the workflow is prepared for it.</w:t>
-      </w:r>
-    </w:p>
-    <w:p>
-      <w:pPr>
-        <w:pStyle w:val="ListParagraph"/>
-        <w:numPr>
-          <w:ilvl w:val="1"/>
-          <w:numId w:val="15"/>
-        </w:numPr>
-      </w:pPr>
-      <w:r>
-        <w:t>Other studies have provided overviews of similar open-access workflows e.g., what software to use and full code examples can be found in open-</w:t>
-      </w:r>
-      <w:r>
-        <w:lastRenderedPageBreak/>
-        <w:t>source workflows, but this is often complex. This workflow bridges the gap by providing a simple, reproducible workflow that</w:t>
       </w:r>
     </w:p>
     <w:p>
@@ -3012,6 +3089,92 @@
     </w:lvl>
   </w:abstractNum>
   <w:abstractNum w:abstractNumId="8" w15:restartNumberingAfterBreak="0">
+    <w:nsid w:val="42CD6CBA"/>
+    <w:multiLevelType w:val="hybridMultilevel"/>
+    <w:tmpl w:val="EF2CF2BC"/>
+    <w:lvl w:ilvl="0" w:tplc="FFFFFFFF">
+      <w:start w:val="1"/>
+      <w:numFmt w:val="lowerLetter"/>
+      <w:lvlText w:val="%1."/>
+      <w:lvlJc w:val="left"/>
+      <w:pPr>
+        <w:ind w:left="1440" w:hanging="360"/>
+      </w:pPr>
+    </w:lvl>
+    <w:lvl w:ilvl="1" w:tplc="08090019" w:tentative="1">
+      <w:start w:val="1"/>
+      <w:numFmt w:val="lowerLetter"/>
+      <w:lvlText w:val="%2."/>
+      <w:lvlJc w:val="left"/>
+      <w:pPr>
+        <w:ind w:left="1440" w:hanging="360"/>
+      </w:pPr>
+    </w:lvl>
+    <w:lvl w:ilvl="2" w:tplc="0809001B" w:tentative="1">
+      <w:start w:val="1"/>
+      <w:numFmt w:val="lowerRoman"/>
+      <w:lvlText w:val="%3."/>
+      <w:lvlJc w:val="right"/>
+      <w:pPr>
+        <w:ind w:left="2160" w:hanging="180"/>
+      </w:pPr>
+    </w:lvl>
+    <w:lvl w:ilvl="3" w:tplc="0809000F" w:tentative="1">
+      <w:start w:val="1"/>
+      <w:numFmt w:val="decimal"/>
+      <w:lvlText w:val="%4."/>
+      <w:lvlJc w:val="left"/>
+      <w:pPr>
+        <w:ind w:left="2880" w:hanging="360"/>
+      </w:pPr>
+    </w:lvl>
+    <w:lvl w:ilvl="4" w:tplc="08090019" w:tentative="1">
+      <w:start w:val="1"/>
+      <w:numFmt w:val="lowerLetter"/>
+      <w:lvlText w:val="%5."/>
+      <w:lvlJc w:val="left"/>
+      <w:pPr>
+        <w:ind w:left="3600" w:hanging="360"/>
+      </w:pPr>
+    </w:lvl>
+    <w:lvl w:ilvl="5" w:tplc="0809001B" w:tentative="1">
+      <w:start w:val="1"/>
+      <w:numFmt w:val="lowerRoman"/>
+      <w:lvlText w:val="%6."/>
+      <w:lvlJc w:val="right"/>
+      <w:pPr>
+        <w:ind w:left="4320" w:hanging="180"/>
+      </w:pPr>
+    </w:lvl>
+    <w:lvl w:ilvl="6" w:tplc="0809000F" w:tentative="1">
+      <w:start w:val="1"/>
+      <w:numFmt w:val="decimal"/>
+      <w:lvlText w:val="%7."/>
+      <w:lvlJc w:val="left"/>
+      <w:pPr>
+        <w:ind w:left="5040" w:hanging="360"/>
+      </w:pPr>
+    </w:lvl>
+    <w:lvl w:ilvl="7" w:tplc="08090019" w:tentative="1">
+      <w:start w:val="1"/>
+      <w:numFmt w:val="lowerLetter"/>
+      <w:lvlText w:val="%8."/>
+      <w:lvlJc w:val="left"/>
+      <w:pPr>
+        <w:ind w:left="5760" w:hanging="360"/>
+      </w:pPr>
+    </w:lvl>
+    <w:lvl w:ilvl="8" w:tplc="0809001B" w:tentative="1">
+      <w:start w:val="1"/>
+      <w:numFmt w:val="lowerRoman"/>
+      <w:lvlText w:val="%9."/>
+      <w:lvlJc w:val="right"/>
+      <w:pPr>
+        <w:ind w:left="6480" w:hanging="180"/>
+      </w:pPr>
+    </w:lvl>
+  </w:abstractNum>
+  <w:abstractNum w:abstractNumId="9" w15:restartNumberingAfterBreak="0">
     <w:nsid w:val="43C51E24"/>
     <w:multiLevelType w:val="hybridMultilevel"/>
     <w:tmpl w:val="159AFA2A"/>
@@ -3151,7 +3314,7 @@
       </w:rPr>
     </w:lvl>
   </w:abstractNum>
-  <w:abstractNum w:abstractNumId="9" w15:restartNumberingAfterBreak="0">
+  <w:abstractNum w:abstractNumId="10" w15:restartNumberingAfterBreak="0">
     <w:nsid w:val="46E864D5"/>
     <w:multiLevelType w:val="hybridMultilevel"/>
     <w:tmpl w:val="FC2CBD7C"/>
@@ -3264,7 +3427,7 @@
       </w:rPr>
     </w:lvl>
   </w:abstractNum>
-  <w:abstractNum w:abstractNumId="10" w15:restartNumberingAfterBreak="0">
+  <w:abstractNum w:abstractNumId="11" w15:restartNumberingAfterBreak="0">
     <w:nsid w:val="47524B31"/>
     <w:multiLevelType w:val="hybridMultilevel"/>
     <w:tmpl w:val="1DB64F7C"/>
@@ -3353,7 +3516,7 @@
       </w:pPr>
     </w:lvl>
   </w:abstractNum>
-  <w:abstractNum w:abstractNumId="11" w15:restartNumberingAfterBreak="0">
+  <w:abstractNum w:abstractNumId="12" w15:restartNumberingAfterBreak="0">
     <w:nsid w:val="692B5E95"/>
     <w:multiLevelType w:val="hybridMultilevel"/>
     <w:tmpl w:val="6AD03B7C"/>
@@ -3466,7 +3629,7 @@
       </w:rPr>
     </w:lvl>
   </w:abstractNum>
-  <w:abstractNum w:abstractNumId="12" w15:restartNumberingAfterBreak="0">
+  <w:abstractNum w:abstractNumId="13" w15:restartNumberingAfterBreak="0">
     <w:nsid w:val="746A5C0A"/>
     <w:multiLevelType w:val="hybridMultilevel"/>
     <w:tmpl w:val="50DEA51A"/>
@@ -3579,7 +3742,7 @@
       </w:rPr>
     </w:lvl>
   </w:abstractNum>
-  <w:abstractNum w:abstractNumId="13" w15:restartNumberingAfterBreak="0">
+  <w:abstractNum w:abstractNumId="14" w15:restartNumberingAfterBreak="0">
     <w:nsid w:val="797425C7"/>
     <w:multiLevelType w:val="hybridMultilevel"/>
     <w:tmpl w:val="1316934A"/>
@@ -3665,7 +3828,7 @@
       </w:pPr>
     </w:lvl>
   </w:abstractNum>
-  <w:abstractNum w:abstractNumId="14" w15:restartNumberingAfterBreak="0">
+  <w:abstractNum w:abstractNumId="15" w15:restartNumberingAfterBreak="0">
     <w:nsid w:val="7B095B35"/>
     <w:multiLevelType w:val="hybridMultilevel"/>
     <w:tmpl w:val="1DB64F7C"/>
@@ -3755,22 +3918,22 @@
     </w:lvl>
   </w:abstractNum>
   <w:num w:numId="1" w16cid:durableId="853226515">
-    <w:abstractNumId w:val="12"/>
+    <w:abstractNumId w:val="13"/>
   </w:num>
   <w:num w:numId="2" w16cid:durableId="1597787845">
     <w:abstractNumId w:val="4"/>
   </w:num>
   <w:num w:numId="3" w16cid:durableId="1477526337">
-    <w:abstractNumId w:val="11"/>
+    <w:abstractNumId w:val="12"/>
   </w:num>
   <w:num w:numId="4" w16cid:durableId="2027368701">
     <w:abstractNumId w:val="2"/>
   </w:num>
   <w:num w:numId="5" w16cid:durableId="223413464">
-    <w:abstractNumId w:val="13"/>
+    <w:abstractNumId w:val="14"/>
   </w:num>
   <w:num w:numId="6" w16cid:durableId="1725175944">
-    <w:abstractNumId w:val="9"/>
+    <w:abstractNumId w:val="10"/>
   </w:num>
   <w:num w:numId="7" w16cid:durableId="1661734116">
     <w:abstractNumId w:val="6"/>
@@ -3788,16 +3951,19 @@
     <w:abstractNumId w:val="1"/>
   </w:num>
   <w:num w:numId="12" w16cid:durableId="720862797">
-    <w:abstractNumId w:val="8"/>
+    <w:abstractNumId w:val="9"/>
   </w:num>
   <w:num w:numId="13" w16cid:durableId="1229655824">
     <w:abstractNumId w:val="7"/>
   </w:num>
   <w:num w:numId="14" w16cid:durableId="1851329029">
-    <w:abstractNumId w:val="10"/>
+    <w:abstractNumId w:val="11"/>
   </w:num>
   <w:num w:numId="15" w16cid:durableId="1095856647">
-    <w:abstractNumId w:val="14"/>
+    <w:abstractNumId w:val="15"/>
+  </w:num>
+  <w:num w:numId="16" w16cid:durableId="1673605468">
+    <w:abstractNumId w:val="8"/>
   </w:num>
 </w:numbering>
 </file>
@@ -4202,6 +4368,7 @@
   <w:style w:type="paragraph" w:default="1" w:styleId="Normal">
     <w:name w:val="Normal"/>
     <w:qFormat/>
+    <w:rsid w:val="00AC254E"/>
   </w:style>
   <w:style w:type="paragraph" w:styleId="Heading1">
     <w:name w:val="heading 1"/>
@@ -4405,7 +4572,6 @@
   <w:style w:type="character" w:default="1" w:styleId="DefaultParagraphFont">
     <w:name w:val="Default Paragraph Font"/>
     <w:uiPriority w:val="1"/>
-    <w:semiHidden/>
     <w:unhideWhenUsed/>
   </w:style>
   <w:style w:type="table" w:default="1" w:styleId="TableNormal">

</xml_diff>

<commit_message>
ADDING TODAY'S WORK - 07.08.2026
</commit_message>
<xml_diff>
--- a/viva/viva_presentation_plan.docx
+++ b/viva/viva_presentation_plan.docx
@@ -51,7 +51,15 @@
         </w:numPr>
       </w:pPr>
       <w:r>
-        <w:t>The talk should end with a brief summary of key take-home messages.</w:t>
+        <w:t xml:space="preserve">The talk should end with </w:t>
+      </w:r>
+      <w:proofErr w:type="gramStart"/>
+      <w:r>
+        <w:t>a brief summary</w:t>
+      </w:r>
+      <w:proofErr w:type="gramEnd"/>
+      <w:r>
+        <w:t xml:space="preserve"> of key take-home messages.</w:t>
       </w:r>
     </w:p>
     <w:p>
@@ -136,7 +144,15 @@
         </w:numPr>
       </w:pPr>
       <w:r>
-        <w:t>Bring backup pdf version in case powerpoint does not work for whatever reason</w:t>
+        <w:t xml:space="preserve">Bring backup pdf version in case </w:t>
+      </w:r>
+      <w:proofErr w:type="spellStart"/>
+      <w:r>
+        <w:t>powerpoint</w:t>
+      </w:r>
+      <w:proofErr w:type="spellEnd"/>
+      <w:r>
+        <w:t xml:space="preserve"> does not work for whatever reason</w:t>
       </w:r>
     </w:p>
     <w:p>
@@ -148,7 +164,15 @@
         </w:numPr>
       </w:pPr>
       <w:r>
-        <w:t>Can test the powerpoint in the room before the presentation date</w:t>
+        <w:t xml:space="preserve">Can test the </w:t>
+      </w:r>
+      <w:proofErr w:type="spellStart"/>
+      <w:r>
+        <w:t>powerpoint</w:t>
+      </w:r>
+      <w:proofErr w:type="spellEnd"/>
+      <w:r>
+        <w:t xml:space="preserve"> in the room before the presentation date</w:t>
       </w:r>
     </w:p>
     <w:p>
@@ -208,7 +232,15 @@
         </w:numPr>
       </w:pPr>
       <w:r>
-        <w:t>Summarise at the end: Finish with key takeaways and invite questions: “In summary, this work shows X, contributes Y, and opens up Z. I’m happy to take any questions.”</w:t>
+        <w:t xml:space="preserve">Summarise at the end: Finish with key takeaways and invite questions: “In summary, this work shows X, contributes Y, and </w:t>
+      </w:r>
+      <w:proofErr w:type="gramStart"/>
+      <w:r>
+        <w:t>opens up</w:t>
+      </w:r>
+      <w:proofErr w:type="gramEnd"/>
+      <w:r>
+        <w:t xml:space="preserve"> Z. I’m happy to take any questions.”</w:t>
       </w:r>
     </w:p>
     <w:p>
@@ -267,7 +299,39 @@
         </w:numPr>
       </w:pPr>
       <w:r>
-        <w:t>Initially, I was going to compare against tamirna and vicky’s pathway results but didn’t have enough time to do a formal compairson against tamirna (although did quick check) and it was revealed that Vicky used a proprietary software that didn’t use the same database (although looked for similar pathways e.g., immune-related)</w:t>
+        <w:t xml:space="preserve">Initially, I was going to compare against </w:t>
+      </w:r>
+      <w:proofErr w:type="spellStart"/>
+      <w:r>
+        <w:t>tamirna</w:t>
+      </w:r>
+      <w:proofErr w:type="spellEnd"/>
+      <w:r>
+        <w:t xml:space="preserve"> and </w:t>
+      </w:r>
+      <w:proofErr w:type="spellStart"/>
+      <w:r>
+        <w:t>vicky’s</w:t>
+      </w:r>
+      <w:proofErr w:type="spellEnd"/>
+      <w:r>
+        <w:t xml:space="preserve"> pathway results but didn’t have enough time to do a formal </w:t>
+      </w:r>
+      <w:proofErr w:type="spellStart"/>
+      <w:r>
+        <w:t>compairson</w:t>
+      </w:r>
+      <w:proofErr w:type="spellEnd"/>
+      <w:r>
+        <w:t xml:space="preserve"> against </w:t>
+      </w:r>
+      <w:proofErr w:type="spellStart"/>
+      <w:r>
+        <w:t>tamirna</w:t>
+      </w:r>
+      <w:proofErr w:type="spellEnd"/>
+      <w:r>
+        <w:t xml:space="preserve"> (although did quick check) and it was revealed that Vicky used a proprietary software that didn’t use the same database (although looked for similar pathways e.g., immune-related)</w:t>
       </w:r>
     </w:p>
     <w:p>
@@ -294,7 +358,15 @@
         </w:numPr>
       </w:pPr>
       <w:r>
-        <w:t>Aim of the work (1) = I wanted to create a pipeline that is user-friendly for non-bioinformaticians because the lab usually outsource this work (DE analysis) for a lot of money so I wanted to see whether comparable results could be gained using free software</w:t>
+        <w:t xml:space="preserve">Aim of the work (1) = I wanted to create a pipeline that is user-friendly for non-bioinformaticians because the lab usually </w:t>
+      </w:r>
+      <w:proofErr w:type="gramStart"/>
+      <w:r>
+        <w:t>outsource</w:t>
+      </w:r>
+      <w:proofErr w:type="gramEnd"/>
+      <w:r>
+        <w:t xml:space="preserve"> this work (DE analysis) for a lot of money so I wanted to see whether comparable results could be gained using free software</w:t>
       </w:r>
     </w:p>
     <w:p>
@@ -342,7 +414,15 @@
         </w:numPr>
       </w:pPr>
       <w:r>
-        <w:t>Because so much time was spent on developing the methods and in particular the pathway analysis, I couldn’t do the above points but given more time I would</w:t>
+        <w:t>Because so much time was spent on developing the methods</w:t>
+      </w:r>
+      <w:proofErr w:type="gramStart"/>
+      <w:r>
+        <w:t xml:space="preserve"> and in particular</w:t>
+      </w:r>
+      <w:proofErr w:type="gramEnd"/>
+      <w:r>
+        <w:t xml:space="preserve"> the pathway analysis, I couldn’t do the above points but given more time I would</w:t>
       </w:r>
     </w:p>
     <w:p>
@@ -411,8 +491,13 @@
           <w:numId w:val="7"/>
         </w:numPr>
       </w:pPr>
-      <w:r>
-        <w:t xml:space="preserve">Biorender citation for figure legend: </w:t>
+      <w:proofErr w:type="spellStart"/>
+      <w:r>
+        <w:t>Biorender</w:t>
+      </w:r>
+      <w:proofErr w:type="spellEnd"/>
+      <w:r>
+        <w:t xml:space="preserve"> citation for figure legend: </w:t>
       </w:r>
       <w:r>
         <w:t xml:space="preserve">Created in  </w:t>
@@ -481,6 +566,37 @@
         <w:t>Maybe if I have extra time that needs using</w:t>
       </w:r>
     </w:p>
+    <w:p>
+      <w:pPr>
+        <w:pStyle w:val="ListParagraph"/>
+        <w:numPr>
+          <w:ilvl w:val="0"/>
+          <w:numId w:val="7"/>
+        </w:numPr>
+      </w:pPr>
+      <w:r>
+        <w:t xml:space="preserve">Use a simple slide theme because otherwise it looks too basic – can turn the theme off on the slides that have lots of images and would otherwise obscure </w:t>
+      </w:r>
+      <w:r>
+        <w:lastRenderedPageBreak/>
+        <w:t>the theme. Would it be appropriate to use the UoN slide theme because it is UoN research?</w:t>
+      </w:r>
+    </w:p>
+    <w:p>
+      <w:pPr>
+        <w:pStyle w:val="ListParagraph"/>
+        <w:numPr>
+          <w:ilvl w:val="0"/>
+          <w:numId w:val="7"/>
+        </w:numPr>
+      </w:pPr>
+      <w:r>
+        <w:t xml:space="preserve">Add a list of software </w:t>
+      </w:r>
+      <w:r>
+        <w:t>slide?</w:t>
+      </w:r>
+    </w:p>
     <w:p/>
     <w:p/>
     <w:p>
@@ -857,6 +973,7 @@
         </w:numPr>
       </w:pPr>
       <w:r>
+        <w:lastRenderedPageBreak/>
         <w:t>Findings</w:t>
       </w:r>
     </w:p>
@@ -893,26 +1010,634 @@
         </w:numPr>
       </w:pPr>
       <w:r>
+        <w:t xml:space="preserve">Literature of calu-3 </w:t>
+      </w:r>
+      <w:r>
+        <w:t>DE</w:t>
+      </w:r>
+      <w:r>
+        <w:t xml:space="preserve"> miRNAs revealed some relevance to airway inflammation however these findings should be considered cautiously</w:t>
+      </w:r>
+    </w:p>
+    <w:p>
+      <w:pPr>
+        <w:pStyle w:val="ListParagraph"/>
+        <w:numPr>
+          <w:ilvl w:val="1"/>
+          <w:numId w:val="14"/>
+        </w:numPr>
+      </w:pPr>
+      <w:r>
+        <w:t>Significance (why it matters)</w:t>
+      </w:r>
+    </w:p>
+    <w:p>
+      <w:pPr>
+        <w:pStyle w:val="ListParagraph"/>
+        <w:numPr>
+          <w:ilvl w:val="2"/>
+          <w:numId w:val="14"/>
+        </w:numPr>
+      </w:pPr>
+      <w:r>
+        <w:t xml:space="preserve">Identified limitations of a dataset intended for publication which may contain </w:t>
+      </w:r>
+      <w:r>
+        <w:t xml:space="preserve">weakly </w:t>
+      </w:r>
+      <w:r>
+        <w:t>supported findings</w:t>
+      </w:r>
+    </w:p>
+    <w:p>
+      <w:pPr>
+        <w:pStyle w:val="ListParagraph"/>
+        <w:numPr>
+          <w:ilvl w:val="2"/>
+          <w:numId w:val="14"/>
+        </w:numPr>
+      </w:pPr>
+      <w:r>
+        <w:t>Identified experimental limitations and offered guidance to produce usable data for the future experiments</w:t>
+      </w:r>
+    </w:p>
+    <w:p>
+      <w:pPr>
+        <w:pStyle w:val="ListParagraph"/>
+        <w:numPr>
+          <w:ilvl w:val="2"/>
+          <w:numId w:val="14"/>
+        </w:numPr>
+      </w:pPr>
+      <w:r>
+        <w:t xml:space="preserve">Provided framework to produce an in-house transcriptomics workflow to avoid repeated high-cost outsourcing meaning more resources to support additional research </w:t>
+      </w:r>
+    </w:p>
+    <w:p>
+      <w:pPr>
+        <w:pStyle w:val="ListParagraph"/>
+        <w:ind w:left="2160"/>
+      </w:pPr>
+    </w:p>
+    <w:p>
+      <w:pPr>
+        <w:pStyle w:val="ListParagraph"/>
+        <w:numPr>
+          <w:ilvl w:val="0"/>
+          <w:numId w:val="14"/>
+        </w:numPr>
+      </w:pPr>
+      <w:r>
+        <w:t>Background</w:t>
+      </w:r>
+    </w:p>
+    <w:p>
+      <w:pPr>
+        <w:pStyle w:val="ListParagraph"/>
+        <w:numPr>
+          <w:ilvl w:val="1"/>
+          <w:numId w:val="14"/>
+        </w:numPr>
+      </w:pPr>
+      <w:r>
+        <w:t xml:space="preserve">Allergens </w:t>
+      </w:r>
+    </w:p>
+    <w:p>
+      <w:pPr>
+        <w:pStyle w:val="ListParagraph"/>
+        <w:numPr>
+          <w:ilvl w:val="1"/>
+          <w:numId w:val="14"/>
+        </w:numPr>
+      </w:pPr>
+      <w:r>
+        <w:t>Epithelial barrier</w:t>
+      </w:r>
+    </w:p>
+    <w:p>
+      <w:pPr>
+        <w:pStyle w:val="ListParagraph"/>
+        <w:numPr>
+          <w:ilvl w:val="1"/>
+          <w:numId w:val="14"/>
+        </w:numPr>
+      </w:pPr>
+      <w:r>
+        <w:t>EVs as signallers / miRNA cargo</w:t>
+      </w:r>
+    </w:p>
+    <w:p>
+      <w:pPr>
+        <w:pStyle w:val="ListParagraph"/>
+        <w:numPr>
+          <w:ilvl w:val="1"/>
+          <w:numId w:val="14"/>
+        </w:numPr>
+      </w:pPr>
+      <w:r>
+        <w:t>miRNA post-transcriptionally fine-tune target genes via suppression</w:t>
+      </w:r>
+    </w:p>
+    <w:p>
+      <w:pPr>
+        <w:pStyle w:val="ListParagraph"/>
+        <w:numPr>
+          <w:ilvl w:val="1"/>
+          <w:numId w:val="14"/>
+        </w:numPr>
+      </w:pPr>
+      <w:r>
+        <w:t>Pathways can be affected</w:t>
+      </w:r>
+    </w:p>
+    <w:p>
+      <w:pPr>
+        <w:pStyle w:val="ListParagraph"/>
+        <w:numPr>
+          <w:ilvl w:val="1"/>
+          <w:numId w:val="14"/>
+        </w:numPr>
+      </w:pPr>
+      <w:r>
+        <w:t xml:space="preserve">Figure = </w:t>
+      </w:r>
+      <w:proofErr w:type="spellStart"/>
+      <w:r>
+        <w:t>biorender</w:t>
+      </w:r>
+      <w:proofErr w:type="spellEnd"/>
+      <w:r>
+        <w:t xml:space="preserve"> figure that shows each step </w:t>
+      </w:r>
+      <w:r>
+        <w:t>and</w:t>
+      </w:r>
+      <w:r>
+        <w:t xml:space="preserve"> I can explain each one in more detail</w:t>
+      </w:r>
+    </w:p>
+    <w:p>
+      <w:pPr>
+        <w:pStyle w:val="ListParagraph"/>
+        <w:numPr>
+          <w:ilvl w:val="2"/>
+          <w:numId w:val="14"/>
+        </w:numPr>
+      </w:pPr>
+      <w:r>
+        <w:t>The epithelial barrier as one long line. The different epithelial cells on basal side. Allergens interacting with the apical side of it. EVs produced in response to the allergen. miRNAs visible in the EV as two distinct colours (one for normal, the other for altered). miRNAs interacting and repressing with target genes. Pathways becoming altered.</w:t>
+      </w:r>
+    </w:p>
+    <w:p>
+      <w:pPr>
+        <w:pStyle w:val="ListParagraph"/>
+        <w:ind w:left="1440"/>
+      </w:pPr>
+    </w:p>
+    <w:p>
+      <w:pPr>
+        <w:pStyle w:val="ListParagraph"/>
+        <w:numPr>
+          <w:ilvl w:val="0"/>
+          <w:numId w:val="14"/>
+        </w:numPr>
+      </w:pPr>
+      <w:r>
+        <w:t>Study data</w:t>
+      </w:r>
+      <w:r>
+        <w:t xml:space="preserve"> / experimental design</w:t>
+      </w:r>
+    </w:p>
+    <w:p>
+      <w:pPr>
+        <w:pStyle w:val="ListParagraph"/>
+        <w:numPr>
+          <w:ilvl w:val="1"/>
+          <w:numId w:val="14"/>
+        </w:numPr>
+      </w:pPr>
+      <w:proofErr w:type="spellStart"/>
+      <w:r>
+        <w:t>Biorender</w:t>
+      </w:r>
+      <w:proofErr w:type="spellEnd"/>
+      <w:r>
+        <w:t xml:space="preserve"> figure </w:t>
+      </w:r>
+      <w:proofErr w:type="gramStart"/>
+      <w:r>
+        <w:t>similar to</w:t>
+      </w:r>
+      <w:proofErr w:type="gramEnd"/>
+      <w:r>
+        <w:t xml:space="preserve"> </w:t>
+      </w:r>
+      <w:proofErr w:type="spellStart"/>
+      <w:r>
+        <w:t>georgie’s</w:t>
+      </w:r>
+      <w:proofErr w:type="spellEnd"/>
+    </w:p>
+    <w:p>
+      <w:pPr>
+        <w:pStyle w:val="ListParagraph"/>
+        <w:numPr>
+          <w:ilvl w:val="2"/>
+          <w:numId w:val="14"/>
+        </w:numPr>
+      </w:pPr>
+      <w:r>
+        <w:t>Cell type</w:t>
+      </w:r>
+    </w:p>
+    <w:p>
+      <w:pPr>
+        <w:pStyle w:val="ListParagraph"/>
+        <w:numPr>
+          <w:ilvl w:val="2"/>
+          <w:numId w:val="14"/>
+        </w:numPr>
+      </w:pPr>
+      <w:r>
+        <w:t>Allergen type / nebuliser</w:t>
+      </w:r>
+    </w:p>
+    <w:p>
+      <w:pPr>
+        <w:pStyle w:val="ListParagraph"/>
+        <w:numPr>
+          <w:ilvl w:val="0"/>
+          <w:numId w:val="14"/>
+        </w:numPr>
+      </w:pPr>
+      <w:r>
+        <w:t>Aims</w:t>
+      </w:r>
+    </w:p>
+    <w:p>
+      <w:pPr>
+        <w:pStyle w:val="ListParagraph"/>
+        <w:numPr>
+          <w:ilvl w:val="1"/>
+          <w:numId w:val="14"/>
+        </w:numPr>
+      </w:pPr>
+      <w:r>
+        <w:t>Produce a transcriptomics workflow to analyse EV-derived miRNA data</w:t>
+      </w:r>
+    </w:p>
+    <w:p>
+      <w:pPr>
+        <w:pStyle w:val="ListParagraph"/>
+        <w:numPr>
+          <w:ilvl w:val="1"/>
+          <w:numId w:val="14"/>
+        </w:numPr>
+      </w:pPr>
+      <w:r>
+        <w:t>Use only open-access software</w:t>
+      </w:r>
+    </w:p>
+    <w:p>
+      <w:pPr>
+        <w:pStyle w:val="ListParagraph"/>
+        <w:numPr>
+          <w:ilvl w:val="1"/>
+          <w:numId w:val="14"/>
+        </w:numPr>
+      </w:pPr>
+      <w:r>
+        <w:t>Use the workflow on Calu-3 dataset</w:t>
+      </w:r>
+    </w:p>
+    <w:p>
+      <w:pPr>
+        <w:pStyle w:val="ListParagraph"/>
+        <w:ind w:left="1440"/>
+      </w:pPr>
+    </w:p>
+    <w:p>
+      <w:pPr>
+        <w:pStyle w:val="ListParagraph"/>
+        <w:numPr>
+          <w:ilvl w:val="0"/>
+          <w:numId w:val="14"/>
+        </w:numPr>
+      </w:pPr>
+      <w:r>
         <w:lastRenderedPageBreak/>
-        <w:t xml:space="preserve">Literature of calu-3 </w:t>
-      </w:r>
-      <w:r>
-        <w:t>DE</w:t>
-      </w:r>
-      <w:r>
-        <w:t xml:space="preserve"> miRNAs revealed some relevance to airway inflammation however these findings should be considered cautiously</w:t>
-      </w:r>
-    </w:p>
-    <w:p>
-      <w:pPr>
-        <w:pStyle w:val="ListParagraph"/>
-        <w:numPr>
-          <w:ilvl w:val="1"/>
-          <w:numId w:val="14"/>
-        </w:numPr>
-      </w:pPr>
-      <w:r>
-        <w:t>Significance (why it matters)</w:t>
+        <w:t>Bioinformatics w</w:t>
+      </w:r>
+      <w:r>
+        <w:t>orkflow</w:t>
+      </w:r>
+    </w:p>
+    <w:p>
+      <w:pPr>
+        <w:pStyle w:val="ListParagraph"/>
+        <w:numPr>
+          <w:ilvl w:val="1"/>
+          <w:numId w:val="14"/>
+        </w:numPr>
+      </w:pPr>
+      <w:r>
+        <w:t>Trimming -&gt; qc -&gt; mapping -&gt; quantification -&gt; de analysis -&gt; pathway enrichment analysis / literature search</w:t>
+      </w:r>
+    </w:p>
+    <w:p>
+      <w:pPr>
+        <w:pStyle w:val="ListParagraph"/>
+        <w:ind w:left="1440"/>
+      </w:pPr>
+    </w:p>
+    <w:p>
+      <w:pPr>
+        <w:pStyle w:val="ListParagraph"/>
+        <w:numPr>
+          <w:ilvl w:val="0"/>
+          <w:numId w:val="14"/>
+        </w:numPr>
+      </w:pPr>
+      <w:r>
+        <w:t>Findings (1)</w:t>
+      </w:r>
+    </w:p>
+    <w:p>
+      <w:pPr>
+        <w:pStyle w:val="ListParagraph"/>
+        <w:numPr>
+          <w:ilvl w:val="1"/>
+          <w:numId w:val="14"/>
+        </w:numPr>
+      </w:pPr>
+      <w:r>
+        <w:t xml:space="preserve">Main point = RNA composition differs in 24 </w:t>
+      </w:r>
+      <w:proofErr w:type="gramStart"/>
+      <w:r>
+        <w:t>protease</w:t>
+      </w:r>
+      <w:proofErr w:type="gramEnd"/>
+      <w:r>
+        <w:t xml:space="preserve"> compared to rest</w:t>
+      </w:r>
+      <w:r>
+        <w:t xml:space="preserve"> of protease</w:t>
+      </w:r>
+    </w:p>
+    <w:p>
+      <w:pPr>
+        <w:pStyle w:val="ListParagraph"/>
+        <w:numPr>
+          <w:ilvl w:val="1"/>
+          <w:numId w:val="14"/>
+        </w:numPr>
+      </w:pPr>
+      <w:r>
+        <w:t>Main point = very little miRNA in calu-3 dataset</w:t>
+      </w:r>
+    </w:p>
+    <w:p>
+      <w:pPr>
+        <w:pStyle w:val="ListParagraph"/>
+        <w:numPr>
+          <w:ilvl w:val="1"/>
+          <w:numId w:val="14"/>
+        </w:numPr>
+      </w:pPr>
+      <w:r>
+        <w:t>Figure = RNA composition graph for primary and calu-3</w:t>
+      </w:r>
+    </w:p>
+    <w:p>
+      <w:pPr>
+        <w:pStyle w:val="ListParagraph"/>
+        <w:ind w:left="1440"/>
+      </w:pPr>
+    </w:p>
+    <w:p>
+      <w:pPr>
+        <w:pStyle w:val="ListParagraph"/>
+        <w:numPr>
+          <w:ilvl w:val="0"/>
+          <w:numId w:val="14"/>
+        </w:numPr>
+      </w:pPr>
+      <w:r>
+        <w:t>Findings (2)</w:t>
+      </w:r>
+    </w:p>
+    <w:p>
+      <w:pPr>
+        <w:pStyle w:val="ListParagraph"/>
+        <w:numPr>
+          <w:ilvl w:val="1"/>
+          <w:numId w:val="14"/>
+        </w:numPr>
+      </w:pPr>
+      <w:r>
+        <w:t>Main point =</w:t>
+      </w:r>
+      <w:r>
+        <w:t xml:space="preserve"> differential expression highest in 24 </w:t>
+      </w:r>
+      <w:proofErr w:type="gramStart"/>
+      <w:r>
+        <w:t>protease</w:t>
+      </w:r>
+      <w:proofErr w:type="gramEnd"/>
+      <w:r>
+        <w:t xml:space="preserve"> compared to rest of protease </w:t>
+      </w:r>
+    </w:p>
+    <w:p>
+      <w:pPr>
+        <w:pStyle w:val="ListParagraph"/>
+        <w:numPr>
+          <w:ilvl w:val="1"/>
+          <w:numId w:val="14"/>
+        </w:numPr>
+      </w:pPr>
+      <w:r>
+        <w:t>Main point = limited calu-3 differential expression, even at exploratory FDR threshold</w:t>
+      </w:r>
+    </w:p>
+    <w:p>
+      <w:pPr>
+        <w:pStyle w:val="ListParagraph"/>
+        <w:numPr>
+          <w:ilvl w:val="1"/>
+          <w:numId w:val="14"/>
+        </w:numPr>
+      </w:pPr>
+      <w:r>
+        <w:t>Figure = bar chart of differential expression (have the one extra calu-3 de miRNA in a bright colour to represent the exploratory threshold)</w:t>
+      </w:r>
+    </w:p>
+    <w:p>
+      <w:pPr>
+        <w:pStyle w:val="ListParagraph"/>
+        <w:ind w:left="1440"/>
+      </w:pPr>
+    </w:p>
+    <w:p>
+      <w:pPr>
+        <w:pStyle w:val="ListParagraph"/>
+        <w:numPr>
+          <w:ilvl w:val="0"/>
+          <w:numId w:val="14"/>
+        </w:numPr>
+      </w:pPr>
+      <w:r>
+        <w:t>Findings (3)</w:t>
+      </w:r>
+    </w:p>
+    <w:p>
+      <w:pPr>
+        <w:pStyle w:val="ListParagraph"/>
+        <w:numPr>
+          <w:ilvl w:val="1"/>
+          <w:numId w:val="14"/>
+        </w:numPr>
+      </w:pPr>
+      <w:r>
+        <w:t>Main point =</w:t>
+      </w:r>
+      <w:r>
+        <w:t xml:space="preserve"> target-gene level enrichment provided biologically plausible results for 24 </w:t>
+      </w:r>
+      <w:proofErr w:type="gramStart"/>
+      <w:r>
+        <w:t>protease</w:t>
+      </w:r>
+      <w:proofErr w:type="gramEnd"/>
+    </w:p>
+    <w:p>
+      <w:pPr>
+        <w:pStyle w:val="ListParagraph"/>
+        <w:numPr>
+          <w:ilvl w:val="1"/>
+          <w:numId w:val="14"/>
+        </w:numPr>
+      </w:pPr>
+      <w:r>
+        <w:t xml:space="preserve">Main point = miRNA-level enrichment was not very informative </w:t>
+      </w:r>
+    </w:p>
+    <w:p>
+      <w:pPr>
+        <w:pStyle w:val="ListParagraph"/>
+        <w:numPr>
+          <w:ilvl w:val="1"/>
+          <w:numId w:val="14"/>
+        </w:numPr>
+      </w:pPr>
+      <w:r>
+        <w:t xml:space="preserve">Figure = </w:t>
+      </w:r>
+      <w:proofErr w:type="spellStart"/>
+      <w:r>
+        <w:t>dotplot</w:t>
+      </w:r>
+      <w:proofErr w:type="spellEnd"/>
+      <w:r>
+        <w:t xml:space="preserve"> of up- or down-regulated pathways on the left and the </w:t>
+      </w:r>
+      <w:proofErr w:type="spellStart"/>
+      <w:r>
+        <w:t>miEAA</w:t>
+      </w:r>
+      <w:proofErr w:type="spellEnd"/>
+      <w:r>
+        <w:t xml:space="preserve"> </w:t>
+      </w:r>
+      <w:proofErr w:type="spellStart"/>
+      <w:r>
+        <w:t>wordplot</w:t>
+      </w:r>
+      <w:proofErr w:type="spellEnd"/>
+      <w:r>
+        <w:t xml:space="preserve"> on the right</w:t>
+      </w:r>
+    </w:p>
+    <w:p>
+      <w:pPr>
+        <w:pStyle w:val="ListParagraph"/>
+        <w:ind w:left="1440"/>
+      </w:pPr>
+    </w:p>
+    <w:p>
+      <w:pPr>
+        <w:pStyle w:val="ListParagraph"/>
+        <w:numPr>
+          <w:ilvl w:val="0"/>
+          <w:numId w:val="14"/>
+        </w:numPr>
+      </w:pPr>
+      <w:r>
+        <w:t>Findings (4)</w:t>
+      </w:r>
+    </w:p>
+    <w:p>
+      <w:pPr>
+        <w:pStyle w:val="ListParagraph"/>
+        <w:numPr>
+          <w:ilvl w:val="1"/>
+          <w:numId w:val="14"/>
+        </w:numPr>
+      </w:pPr>
+      <w:r>
+        <w:t>Main point =</w:t>
+      </w:r>
+      <w:r>
+        <w:t xml:space="preserve"> de miRNAs from Can f 1 in calu-3 dataset have been associated with immune-related pathways though </w:t>
+      </w:r>
+      <w:r>
+        <w:t xml:space="preserve">these may not relate to airway biology (although some do). More support for 125 over 574. </w:t>
+      </w:r>
+    </w:p>
+    <w:p>
+      <w:pPr>
+        <w:pStyle w:val="ListParagraph"/>
+        <w:numPr>
+          <w:ilvl w:val="1"/>
+          <w:numId w:val="14"/>
+        </w:numPr>
+      </w:pPr>
+      <w:r>
+        <w:t>main point = 125 also detected in protease dataset</w:t>
+      </w:r>
+    </w:p>
+    <w:p>
+      <w:pPr>
+        <w:pStyle w:val="ListParagraph"/>
+        <w:numPr>
+          <w:ilvl w:val="1"/>
+          <w:numId w:val="14"/>
+        </w:numPr>
+      </w:pPr>
+      <w:r>
+        <w:t>Figure = pie chart of 125 and 574 with the ratio of publications in each category searched for and the total number of publications very clearly marked above or under the chart</w:t>
+      </w:r>
+    </w:p>
+    <w:p>
+      <w:pPr>
+        <w:pStyle w:val="ListParagraph"/>
+        <w:ind w:left="1440"/>
+      </w:pPr>
+    </w:p>
+    <w:p>
+      <w:pPr>
+        <w:pStyle w:val="ListParagraph"/>
+        <w:numPr>
+          <w:ilvl w:val="0"/>
+          <w:numId w:val="14"/>
+        </w:numPr>
+      </w:pPr>
+      <w:r>
+        <w:t>Interpretation</w:t>
       </w:r>
     </w:p>
     <w:p>
@@ -924,13 +1649,19 @@
         </w:numPr>
       </w:pPr>
       <w:r>
-        <w:t xml:space="preserve">Identified limitations of a dataset intended for publication which may contain </w:t>
-      </w:r>
-      <w:r>
-        <w:t xml:space="preserve">weakly </w:t>
-      </w:r>
-      <w:r>
-        <w:t>supported findings</w:t>
+        <w:t>Create transcriptomics workflow using primary HBECs</w:t>
+      </w:r>
+    </w:p>
+    <w:p>
+      <w:pPr>
+        <w:pStyle w:val="ListParagraph"/>
+        <w:numPr>
+          <w:ilvl w:val="1"/>
+          <w:numId w:val="14"/>
+        </w:numPr>
+      </w:pPr>
+      <w:r>
+        <w:t>Immune, inflammatory and epithelial barrier integrity pathways among those enriched which aligns with allergen exposure reaction</w:t>
       </w:r>
     </w:p>
     <w:p>
@@ -942,7 +1673,23 @@
         </w:numPr>
       </w:pPr>
       <w:r>
-        <w:t>Identified experimental limitations and offered guidance to produce usable data for the future experiments</w:t>
+        <w:t>Create transcriptomics workflow using primary HBECs</w:t>
+      </w:r>
+    </w:p>
+    <w:p>
+      <w:pPr>
+        <w:pStyle w:val="ListParagraph"/>
+        <w:numPr>
+          <w:ilvl w:val="1"/>
+          <w:numId w:val="14"/>
+        </w:numPr>
+      </w:pPr>
+      <w:r>
+        <w:t xml:space="preserve">miRNA-level enrichment much more limited, potentially due to smaller databases and miRNA-pathway associations, potentially due to </w:t>
+      </w:r>
+      <w:r>
+        <w:lastRenderedPageBreak/>
+        <w:t>background miRNAs/ranking order/miRNAs observed. These are normally complementary methods not one-or-the-other.</w:t>
       </w:r>
     </w:p>
     <w:p>
@@ -954,103 +1701,46 @@
         </w:numPr>
       </w:pPr>
       <w:r>
-        <w:t xml:space="preserve">Provided framework to produce an in-house transcriptomics workflow to avoid repeated high-cost outsourcing meaning more resources to support additional research </w:t>
-      </w:r>
-    </w:p>
-    <w:p>
-      <w:pPr>
-        <w:pStyle w:val="ListParagraph"/>
-        <w:ind w:left="2160"/>
-      </w:pPr>
-    </w:p>
-    <w:p>
-      <w:pPr>
-        <w:pStyle w:val="ListParagraph"/>
-        <w:numPr>
-          <w:ilvl w:val="0"/>
-          <w:numId w:val="14"/>
-        </w:numPr>
-      </w:pPr>
-      <w:r>
-        <w:t>Background</w:t>
-      </w:r>
-    </w:p>
-    <w:p>
-      <w:pPr>
-        <w:pStyle w:val="ListParagraph"/>
-        <w:numPr>
-          <w:ilvl w:val="1"/>
-          <w:numId w:val="14"/>
-        </w:numPr>
-      </w:pPr>
-      <w:r>
-        <w:t xml:space="preserve">Allergens </w:t>
-      </w:r>
-    </w:p>
-    <w:p>
-      <w:pPr>
-        <w:pStyle w:val="ListParagraph"/>
-        <w:numPr>
-          <w:ilvl w:val="1"/>
-          <w:numId w:val="14"/>
-        </w:numPr>
-      </w:pPr>
-      <w:r>
-        <w:t>Epithelial barrier</w:t>
-      </w:r>
-    </w:p>
-    <w:p>
-      <w:pPr>
-        <w:pStyle w:val="ListParagraph"/>
-        <w:numPr>
-          <w:ilvl w:val="1"/>
-          <w:numId w:val="14"/>
-        </w:numPr>
-      </w:pPr>
-      <w:r>
-        <w:t>EVs as signallers / miRNA cargo</w:t>
-      </w:r>
-    </w:p>
-    <w:p>
-      <w:pPr>
-        <w:pStyle w:val="ListParagraph"/>
-        <w:numPr>
-          <w:ilvl w:val="1"/>
-          <w:numId w:val="14"/>
-        </w:numPr>
-      </w:pPr>
-      <w:r>
-        <w:t>miRNA post-transcriptionally fine-tune target genes via suppression</w:t>
-      </w:r>
-    </w:p>
-    <w:p>
-      <w:pPr>
-        <w:pStyle w:val="ListParagraph"/>
-        <w:numPr>
-          <w:ilvl w:val="1"/>
-          <w:numId w:val="14"/>
-        </w:numPr>
-      </w:pPr>
-      <w:r>
-        <w:t>Pathways can be affected</w:t>
-      </w:r>
-    </w:p>
-    <w:p>
-      <w:pPr>
-        <w:pStyle w:val="ListParagraph"/>
-        <w:numPr>
-          <w:ilvl w:val="1"/>
-          <w:numId w:val="14"/>
-        </w:numPr>
-      </w:pPr>
-      <w:r>
-        <w:t xml:space="preserve">Figure = biorender figure that shows each step </w:t>
-      </w:r>
-      <w:r>
-        <w:t>and</w:t>
-      </w:r>
-      <w:r>
-        <w:t xml:space="preserve"> I can explain each one in more detail</w:t>
+        <w:t>Apply the workflow to the Calu-3 dataset</w:t>
+      </w:r>
+    </w:p>
+    <w:p>
+      <w:pPr>
+        <w:pStyle w:val="ListParagraph"/>
+        <w:numPr>
+          <w:ilvl w:val="1"/>
+          <w:numId w:val="14"/>
+        </w:numPr>
+      </w:pPr>
+      <w:r>
+        <w:t>Established role of miR-125b-5p in immune biology but potentially not fully established in airway yet – though presence in respiratory diseases was found. Not much evidence for the role of miR</w:t>
+      </w:r>
+      <w:r>
+        <w:t>-</w:t>
+      </w:r>
+      <w:r>
+        <w:t>574-5p so this may be more novel or may not represent a genuine association – emerging role in immune response</w:t>
+      </w:r>
+      <w:r>
+        <w:t xml:space="preserve"> (</w:t>
+      </w:r>
+      <w:r>
+        <w:t>TLR7/8 signalling</w:t>
+      </w:r>
+      <w:r>
+        <w:t>)</w:t>
+      </w:r>
+      <w:r>
+        <w:t xml:space="preserve"> with some recent papers</w:t>
+      </w:r>
+      <w:r>
+        <w:t xml:space="preserve">. </w:t>
+      </w:r>
+      <w:r>
+        <w:t>miR-125b-5p also appeared in the dose 24 protease samples</w:t>
+      </w:r>
+      <w:r>
+        <w:t xml:space="preserve"> </w:t>
       </w:r>
     </w:p>
     <w:p>
@@ -1062,7 +1752,28 @@
         </w:numPr>
       </w:pPr>
       <w:r>
-        <w:t>The epithelial barrier as one long line. The different epithelial cells on basal side. Allergens interacting with the apical side of it. EVs produced in response to the allergen. miRNAs visible in the EV as two distinct colours (one for normal, the other for altered). miRNAs interacting and repressing with target genes. Pathways becoming altered.</w:t>
+        <w:t>Additional finding</w:t>
+      </w:r>
+    </w:p>
+    <w:p>
+      <w:pPr>
+        <w:pStyle w:val="ListParagraph"/>
+        <w:numPr>
+          <w:ilvl w:val="1"/>
+          <w:numId w:val="14"/>
+        </w:numPr>
+      </w:pPr>
+      <w:r>
+        <w:t>D</w:t>
+      </w:r>
+      <w:r>
+        <w:t xml:space="preserve">ifferent RNA profile in protease dose 24 samples </w:t>
+      </w:r>
+      <w:r>
+        <w:t>suggest</w:t>
+      </w:r>
+      <w:r>
+        <w:t xml:space="preserve"> allergen exposure has broader effects than just on the miRNA</w:t>
       </w:r>
     </w:p>
     <w:p>
@@ -1080,94 +1791,70 @@
         </w:numPr>
       </w:pPr>
       <w:r>
-        <w:t>Study data</w:t>
-      </w:r>
-      <w:r>
-        <w:t xml:space="preserve"> / experimental design</w:t>
-      </w:r>
-    </w:p>
-    <w:p>
-      <w:pPr>
-        <w:pStyle w:val="ListParagraph"/>
-        <w:numPr>
-          <w:ilvl w:val="1"/>
-          <w:numId w:val="14"/>
-        </w:numPr>
-      </w:pPr>
-      <w:r>
-        <w:t>Biorender figure similar to georgie’s</w:t>
-      </w:r>
-    </w:p>
-    <w:p>
-      <w:pPr>
-        <w:pStyle w:val="ListParagraph"/>
-        <w:numPr>
-          <w:ilvl w:val="2"/>
-          <w:numId w:val="14"/>
-        </w:numPr>
-      </w:pPr>
-      <w:r>
-        <w:t>Cell type</w:t>
-      </w:r>
-    </w:p>
-    <w:p>
-      <w:pPr>
-        <w:pStyle w:val="ListParagraph"/>
-        <w:numPr>
-          <w:ilvl w:val="2"/>
-          <w:numId w:val="14"/>
-        </w:numPr>
-      </w:pPr>
-      <w:r>
-        <w:t>Allergen type / nebuliser</w:t>
-      </w:r>
-    </w:p>
-    <w:p>
-      <w:pPr>
-        <w:pStyle w:val="ListParagraph"/>
-        <w:numPr>
-          <w:ilvl w:val="0"/>
-          <w:numId w:val="14"/>
-        </w:numPr>
-      </w:pPr>
-      <w:r>
-        <w:t>Aims</w:t>
-      </w:r>
-    </w:p>
-    <w:p>
-      <w:pPr>
-        <w:pStyle w:val="ListParagraph"/>
-        <w:numPr>
-          <w:ilvl w:val="1"/>
-          <w:numId w:val="14"/>
-        </w:numPr>
-      </w:pPr>
-      <w:r>
-        <w:t>Produce a transcriptomics workflow to analyse EV-derived miRNA data</w:t>
-      </w:r>
-    </w:p>
-    <w:p>
-      <w:pPr>
-        <w:pStyle w:val="ListParagraph"/>
-        <w:numPr>
-          <w:ilvl w:val="1"/>
-          <w:numId w:val="14"/>
-        </w:numPr>
-      </w:pPr>
-      <w:r>
-        <w:t>Use only open-access software</w:t>
-      </w:r>
-    </w:p>
-    <w:p>
-      <w:pPr>
-        <w:pStyle w:val="ListParagraph"/>
-        <w:numPr>
-          <w:ilvl w:val="1"/>
-          <w:numId w:val="14"/>
-        </w:numPr>
-      </w:pPr>
-      <w:r>
-        <w:t>Use the workflow on Calu-3 dataset</w:t>
+        <w:t>Workflow limitations / robustness of findings</w:t>
+      </w:r>
+      <w:r>
+        <w:t xml:space="preserve"> [e.g., including strengths?]</w:t>
+      </w:r>
+    </w:p>
+    <w:p>
+      <w:pPr>
+        <w:pStyle w:val="ListParagraph"/>
+        <w:numPr>
+          <w:ilvl w:val="1"/>
+          <w:numId w:val="14"/>
+        </w:numPr>
+      </w:pPr>
+      <w:r>
+        <w:t>Didn’t use alternate pathway enrichment methods e.g., network-based enrichment to focus pathway enrichment on key regulatory genes</w:t>
+      </w:r>
+    </w:p>
+    <w:p>
+      <w:pPr>
+        <w:pStyle w:val="ListParagraph"/>
+        <w:numPr>
+          <w:ilvl w:val="1"/>
+          <w:numId w:val="14"/>
+        </w:numPr>
+      </w:pPr>
+      <w:r>
+        <w:t xml:space="preserve">Target-gene pathway enrichment analysis constrained by lack of context-dependent filtering which was hard to integrate </w:t>
+      </w:r>
+    </w:p>
+    <w:p>
+      <w:pPr>
+        <w:pStyle w:val="ListParagraph"/>
+        <w:numPr>
+          <w:ilvl w:val="1"/>
+          <w:numId w:val="14"/>
+        </w:numPr>
+      </w:pPr>
+      <w:r>
+        <w:t>Couldn’t remove outlier samples identified as distant through PCA or lacking concordance in expression levels due to only 3 biological replicates</w:t>
+      </w:r>
+    </w:p>
+    <w:p>
+      <w:pPr>
+        <w:pStyle w:val="ListParagraph"/>
+        <w:numPr>
+          <w:ilvl w:val="1"/>
+          <w:numId w:val="14"/>
+        </w:numPr>
+      </w:pPr>
+      <w:r>
+        <w:t>Robustness of Calu-3 results majorly compromised due to low miRNA abundance, with no more than 5000 miRNA molecules identified in any sample</w:t>
+      </w:r>
+    </w:p>
+    <w:p>
+      <w:pPr>
+        <w:pStyle w:val="ListParagraph"/>
+        <w:numPr>
+          <w:ilvl w:val="1"/>
+          <w:numId w:val="14"/>
+        </w:numPr>
+      </w:pPr>
+      <w:r>
+        <w:t>[strengths: experimentally validated targets, …]</w:t>
       </w:r>
     </w:p>
     <w:p>
@@ -1185,515 +1872,6 @@
         </w:numPr>
       </w:pPr>
       <w:r>
-        <w:t>Bioinformatics w</w:t>
-      </w:r>
-      <w:r>
-        <w:t>orkflow</w:t>
-      </w:r>
-    </w:p>
-    <w:p>
-      <w:pPr>
-        <w:pStyle w:val="ListParagraph"/>
-        <w:numPr>
-          <w:ilvl w:val="1"/>
-          <w:numId w:val="14"/>
-        </w:numPr>
-      </w:pPr>
-      <w:r>
-        <w:t>Trimming -&gt; qc -&gt; mapping -&gt; quantification -&gt; de analysis -&gt; pathway enrichment analysis / literature search</w:t>
-      </w:r>
-    </w:p>
-    <w:p>
-      <w:pPr>
-        <w:pStyle w:val="ListParagraph"/>
-        <w:ind w:left="1440"/>
-      </w:pPr>
-    </w:p>
-    <w:p>
-      <w:pPr>
-        <w:pStyle w:val="ListParagraph"/>
-        <w:numPr>
-          <w:ilvl w:val="0"/>
-          <w:numId w:val="14"/>
-        </w:numPr>
-      </w:pPr>
-      <w:r>
-        <w:t>Findings (1)</w:t>
-      </w:r>
-    </w:p>
-    <w:p>
-      <w:pPr>
-        <w:pStyle w:val="ListParagraph"/>
-        <w:numPr>
-          <w:ilvl w:val="1"/>
-          <w:numId w:val="14"/>
-        </w:numPr>
-      </w:pPr>
-      <w:r>
-        <w:lastRenderedPageBreak/>
-        <w:t>Main point = RNA composition differs in 24 protease compared to rest</w:t>
-      </w:r>
-      <w:r>
-        <w:t xml:space="preserve"> of protease</w:t>
-      </w:r>
-    </w:p>
-    <w:p>
-      <w:pPr>
-        <w:pStyle w:val="ListParagraph"/>
-        <w:numPr>
-          <w:ilvl w:val="1"/>
-          <w:numId w:val="14"/>
-        </w:numPr>
-      </w:pPr>
-      <w:r>
-        <w:t>Main point = very little miRNA in calu-3 dataset</w:t>
-      </w:r>
-    </w:p>
-    <w:p>
-      <w:pPr>
-        <w:pStyle w:val="ListParagraph"/>
-        <w:numPr>
-          <w:ilvl w:val="1"/>
-          <w:numId w:val="14"/>
-        </w:numPr>
-      </w:pPr>
-      <w:r>
-        <w:t>Figure = RNA composition graph for primary and calu-3</w:t>
-      </w:r>
-    </w:p>
-    <w:p>
-      <w:pPr>
-        <w:pStyle w:val="ListParagraph"/>
-        <w:ind w:left="1440"/>
-      </w:pPr>
-    </w:p>
-    <w:p>
-      <w:pPr>
-        <w:pStyle w:val="ListParagraph"/>
-        <w:numPr>
-          <w:ilvl w:val="0"/>
-          <w:numId w:val="14"/>
-        </w:numPr>
-      </w:pPr>
-      <w:r>
-        <w:t>Findings (2)</w:t>
-      </w:r>
-    </w:p>
-    <w:p>
-      <w:pPr>
-        <w:pStyle w:val="ListParagraph"/>
-        <w:numPr>
-          <w:ilvl w:val="1"/>
-          <w:numId w:val="14"/>
-        </w:numPr>
-      </w:pPr>
-      <w:r>
-        <w:t>Main point =</w:t>
-      </w:r>
-      <w:r>
-        <w:t xml:space="preserve"> differential expression highest in 24 protease compared to rest of protease </w:t>
-      </w:r>
-    </w:p>
-    <w:p>
-      <w:pPr>
-        <w:pStyle w:val="ListParagraph"/>
-        <w:numPr>
-          <w:ilvl w:val="1"/>
-          <w:numId w:val="14"/>
-        </w:numPr>
-      </w:pPr>
-      <w:r>
-        <w:t>Main point = limited calu-3 differential expression, even at exploratory FDR threshold</w:t>
-      </w:r>
-    </w:p>
-    <w:p>
-      <w:pPr>
-        <w:pStyle w:val="ListParagraph"/>
-        <w:numPr>
-          <w:ilvl w:val="1"/>
-          <w:numId w:val="14"/>
-        </w:numPr>
-      </w:pPr>
-      <w:r>
-        <w:t>Figure = bar chart of differential expression (have the one extra calu-3 de miRNA in a bright colour to represent the exploratory threshold)</w:t>
-      </w:r>
-    </w:p>
-    <w:p>
-      <w:pPr>
-        <w:pStyle w:val="ListParagraph"/>
-        <w:ind w:left="1440"/>
-      </w:pPr>
-    </w:p>
-    <w:p>
-      <w:pPr>
-        <w:pStyle w:val="ListParagraph"/>
-        <w:numPr>
-          <w:ilvl w:val="0"/>
-          <w:numId w:val="14"/>
-        </w:numPr>
-      </w:pPr>
-      <w:r>
-        <w:t>Findings (3)</w:t>
-      </w:r>
-    </w:p>
-    <w:p>
-      <w:pPr>
-        <w:pStyle w:val="ListParagraph"/>
-        <w:numPr>
-          <w:ilvl w:val="1"/>
-          <w:numId w:val="14"/>
-        </w:numPr>
-      </w:pPr>
-      <w:r>
-        <w:t>Main point =</w:t>
-      </w:r>
-      <w:r>
-        <w:t xml:space="preserve"> target-gene level enrichment provided biologically plausible results for 24 protease</w:t>
-      </w:r>
-    </w:p>
-    <w:p>
-      <w:pPr>
-        <w:pStyle w:val="ListParagraph"/>
-        <w:numPr>
-          <w:ilvl w:val="1"/>
-          <w:numId w:val="14"/>
-        </w:numPr>
-      </w:pPr>
-      <w:r>
-        <w:t xml:space="preserve">Main point = miRNA-level enrichment was not very informative </w:t>
-      </w:r>
-    </w:p>
-    <w:p>
-      <w:pPr>
-        <w:pStyle w:val="ListParagraph"/>
-        <w:numPr>
-          <w:ilvl w:val="1"/>
-          <w:numId w:val="14"/>
-        </w:numPr>
-      </w:pPr>
-      <w:r>
-        <w:t xml:space="preserve">Figure = </w:t>
-      </w:r>
-      <w:r>
-        <w:t>dotplot of up- or down-regulated pathways on the left and the miEAA wordplot on the right</w:t>
-      </w:r>
-    </w:p>
-    <w:p>
-      <w:pPr>
-        <w:pStyle w:val="ListParagraph"/>
-        <w:ind w:left="1440"/>
-      </w:pPr>
-    </w:p>
-    <w:p>
-      <w:pPr>
-        <w:pStyle w:val="ListParagraph"/>
-        <w:numPr>
-          <w:ilvl w:val="0"/>
-          <w:numId w:val="14"/>
-        </w:numPr>
-      </w:pPr>
-      <w:r>
-        <w:t>Findings (4)</w:t>
-      </w:r>
-    </w:p>
-    <w:p>
-      <w:pPr>
-        <w:pStyle w:val="ListParagraph"/>
-        <w:numPr>
-          <w:ilvl w:val="1"/>
-          <w:numId w:val="14"/>
-        </w:numPr>
-      </w:pPr>
-      <w:r>
-        <w:t>Main point =</w:t>
-      </w:r>
-      <w:r>
-        <w:t xml:space="preserve"> de miRNAs from Can f 1 in calu-3 dataset have been associated with immune-related pathways though </w:t>
-      </w:r>
-      <w:r>
-        <w:t xml:space="preserve">these may not relate to airway biology (although some do). More support for 125 over 574. </w:t>
-      </w:r>
-    </w:p>
-    <w:p>
-      <w:pPr>
-        <w:pStyle w:val="ListParagraph"/>
-        <w:numPr>
-          <w:ilvl w:val="1"/>
-          <w:numId w:val="14"/>
-        </w:numPr>
-      </w:pPr>
-      <w:r>
-        <w:t>main point = 125 also detected in protease dataset</w:t>
-      </w:r>
-    </w:p>
-    <w:p>
-      <w:pPr>
-        <w:pStyle w:val="ListParagraph"/>
-        <w:numPr>
-          <w:ilvl w:val="1"/>
-          <w:numId w:val="14"/>
-        </w:numPr>
-      </w:pPr>
-      <w:r>
-        <w:t>Figure = pie chart of 125 and 574 with the ratio of publications in each category searched for and the total number of publications very clearly marked above or under the chart</w:t>
-      </w:r>
-    </w:p>
-    <w:p>
-      <w:pPr>
-        <w:pStyle w:val="ListParagraph"/>
-        <w:ind w:left="1440"/>
-      </w:pPr>
-    </w:p>
-    <w:p>
-      <w:pPr>
-        <w:pStyle w:val="ListParagraph"/>
-        <w:numPr>
-          <w:ilvl w:val="0"/>
-          <w:numId w:val="14"/>
-        </w:numPr>
-      </w:pPr>
-      <w:r>
-        <w:t>Interpretation</w:t>
-      </w:r>
-    </w:p>
-    <w:p>
-      <w:pPr>
-        <w:pStyle w:val="ListParagraph"/>
-        <w:numPr>
-          <w:ilvl w:val="2"/>
-          <w:numId w:val="14"/>
-        </w:numPr>
-      </w:pPr>
-      <w:r>
-        <w:t>Create transcriptomics workflow using primary HBECs</w:t>
-      </w:r>
-    </w:p>
-    <w:p>
-      <w:pPr>
-        <w:pStyle w:val="ListParagraph"/>
-        <w:numPr>
-          <w:ilvl w:val="1"/>
-          <w:numId w:val="14"/>
-        </w:numPr>
-      </w:pPr>
-      <w:r>
-        <w:t>Immune, inflammatory and epithelial barrier integrity pathways among those enriched which aligns with allergen exposure reaction</w:t>
-      </w:r>
-    </w:p>
-    <w:p>
-      <w:pPr>
-        <w:pStyle w:val="ListParagraph"/>
-        <w:numPr>
-          <w:ilvl w:val="2"/>
-          <w:numId w:val="14"/>
-        </w:numPr>
-      </w:pPr>
-      <w:r>
-        <w:t>Create transcriptomics workflow using primary HBECs</w:t>
-      </w:r>
-    </w:p>
-    <w:p>
-      <w:pPr>
-        <w:pStyle w:val="ListParagraph"/>
-        <w:numPr>
-          <w:ilvl w:val="1"/>
-          <w:numId w:val="14"/>
-        </w:numPr>
-      </w:pPr>
-      <w:r>
-        <w:t>miRNA-level enrichment much more limited, potentially due to smaller databases and miRNA-pathway associations, potentially due to background miRNAs/ranking order/miRNAs observed. These are normally complementary methods not one-or-the-other.</w:t>
-      </w:r>
-    </w:p>
-    <w:p>
-      <w:pPr>
-        <w:pStyle w:val="ListParagraph"/>
-        <w:numPr>
-          <w:ilvl w:val="2"/>
-          <w:numId w:val="14"/>
-        </w:numPr>
-      </w:pPr>
-      <w:r>
-        <w:t>Apply the workflow to the Calu-3 dataset</w:t>
-      </w:r>
-    </w:p>
-    <w:p>
-      <w:pPr>
-        <w:pStyle w:val="ListParagraph"/>
-        <w:numPr>
-          <w:ilvl w:val="1"/>
-          <w:numId w:val="14"/>
-        </w:numPr>
-      </w:pPr>
-      <w:r>
-        <w:t xml:space="preserve">Established role of miR-125b-5p in immune biology but potentially not fully established in airway yet – though presence in respiratory diseases </w:t>
-      </w:r>
-      <w:r>
-        <w:lastRenderedPageBreak/>
-        <w:t>was found. Not much evidence for the role of miR</w:t>
-      </w:r>
-      <w:r>
-        <w:t>-</w:t>
-      </w:r>
-      <w:r>
-        <w:t>574-5p so this may be more novel or may not represent a genuine association – emerging role in immune response</w:t>
-      </w:r>
-      <w:r>
-        <w:t xml:space="preserve"> (</w:t>
-      </w:r>
-      <w:r>
-        <w:t>TLR7/8 signalling</w:t>
-      </w:r>
-      <w:r>
-        <w:t>)</w:t>
-      </w:r>
-      <w:r>
-        <w:t xml:space="preserve"> with some recent papers</w:t>
-      </w:r>
-      <w:r>
-        <w:t xml:space="preserve">. </w:t>
-      </w:r>
-      <w:r>
-        <w:t>miR-125b-5p also appeared in the dose 24 protease samples</w:t>
-      </w:r>
-      <w:r>
-        <w:t xml:space="preserve"> </w:t>
-      </w:r>
-    </w:p>
-    <w:p>
-      <w:pPr>
-        <w:pStyle w:val="ListParagraph"/>
-        <w:numPr>
-          <w:ilvl w:val="2"/>
-          <w:numId w:val="14"/>
-        </w:numPr>
-      </w:pPr>
-      <w:r>
-        <w:t>Additional finding</w:t>
-      </w:r>
-    </w:p>
-    <w:p>
-      <w:pPr>
-        <w:pStyle w:val="ListParagraph"/>
-        <w:numPr>
-          <w:ilvl w:val="1"/>
-          <w:numId w:val="14"/>
-        </w:numPr>
-      </w:pPr>
-      <w:r>
-        <w:t>D</w:t>
-      </w:r>
-      <w:r>
-        <w:t xml:space="preserve">ifferent RNA profile in protease dose 24 samples </w:t>
-      </w:r>
-      <w:r>
-        <w:t>suggest</w:t>
-      </w:r>
-      <w:r>
-        <w:t xml:space="preserve"> allergen exposure </w:t>
-      </w:r>
-      <w:r>
-        <w:t>has broader effects than just on the miRNA</w:t>
-      </w:r>
-    </w:p>
-    <w:p>
-      <w:pPr>
-        <w:pStyle w:val="ListParagraph"/>
-        <w:ind w:left="1440"/>
-      </w:pPr>
-    </w:p>
-    <w:p>
-      <w:pPr>
-        <w:pStyle w:val="ListParagraph"/>
-        <w:numPr>
-          <w:ilvl w:val="0"/>
-          <w:numId w:val="14"/>
-        </w:numPr>
-      </w:pPr>
-      <w:r>
-        <w:t>Workflow l</w:t>
-      </w:r>
-      <w:r>
-        <w:t>imitations / robustness of findings</w:t>
-      </w:r>
-      <w:r>
-        <w:t xml:space="preserve"> [e.g., including strengths?]</w:t>
-      </w:r>
-    </w:p>
-    <w:p>
-      <w:pPr>
-        <w:pStyle w:val="ListParagraph"/>
-        <w:numPr>
-          <w:ilvl w:val="1"/>
-          <w:numId w:val="14"/>
-        </w:numPr>
-      </w:pPr>
-      <w:r>
-        <w:t>Didn’t use alternate pathway enrichment methods e.g., network-based enrichment to focus pathway enrichment on key regulatory genes</w:t>
-      </w:r>
-    </w:p>
-    <w:p>
-      <w:pPr>
-        <w:pStyle w:val="ListParagraph"/>
-        <w:numPr>
-          <w:ilvl w:val="1"/>
-          <w:numId w:val="14"/>
-        </w:numPr>
-      </w:pPr>
-      <w:r>
-        <w:t xml:space="preserve">Target-gene pathway enrichment analysis constrained by lack of context-dependent filtering which was hard to integrate </w:t>
-      </w:r>
-    </w:p>
-    <w:p>
-      <w:pPr>
-        <w:pStyle w:val="ListParagraph"/>
-        <w:numPr>
-          <w:ilvl w:val="1"/>
-          <w:numId w:val="14"/>
-        </w:numPr>
-      </w:pPr>
-      <w:r>
-        <w:t>Couldn’t remove outlier samples identified as distant through PCA or lacking concordance in expression levels due to only 3 biological replicates</w:t>
-      </w:r>
-    </w:p>
-    <w:p>
-      <w:pPr>
-        <w:pStyle w:val="ListParagraph"/>
-        <w:numPr>
-          <w:ilvl w:val="1"/>
-          <w:numId w:val="14"/>
-        </w:numPr>
-      </w:pPr>
-      <w:r>
-        <w:t>Robustness of Calu-3 results majorly compromised due to low miRNA abundance, with no more than 5000 miRNA molecules identified in any sample</w:t>
-      </w:r>
-    </w:p>
-    <w:p>
-      <w:pPr>
-        <w:pStyle w:val="ListParagraph"/>
-        <w:numPr>
-          <w:ilvl w:val="1"/>
-          <w:numId w:val="14"/>
-        </w:numPr>
-      </w:pPr>
-      <w:r>
-        <w:t>[strengths: experimentally validated targets, …]</w:t>
-      </w:r>
-    </w:p>
-    <w:p>
-      <w:pPr>
-        <w:pStyle w:val="ListParagraph"/>
-        <w:ind w:left="1440"/>
-      </w:pPr>
-    </w:p>
-    <w:p>
-      <w:pPr>
-        <w:pStyle w:val="ListParagraph"/>
-        <w:numPr>
-          <w:ilvl w:val="0"/>
-          <w:numId w:val="14"/>
-        </w:numPr>
-      </w:pPr>
-      <w:r>
         <w:t>Experimental Design Optimisations</w:t>
       </w:r>
     </w:p>
@@ -1718,7 +1896,15 @@
         </w:numPr>
       </w:pPr>
       <w:r>
-        <w:t>Figure = instead of a list of points make a biorender figure with each point associated with an image (this will increase engagement)</w:t>
+        <w:t xml:space="preserve">Figure = instead of a list of points make a </w:t>
+      </w:r>
+      <w:proofErr w:type="spellStart"/>
+      <w:r>
+        <w:t>biorender</w:t>
+      </w:r>
+      <w:proofErr w:type="spellEnd"/>
+      <w:r>
+        <w:t xml:space="preserve"> figure with each point associated with an image (this will increase engagement)</w:t>
       </w:r>
     </w:p>
     <w:p>
@@ -1819,6 +2005,7 @@
         </w:numPr>
       </w:pPr>
       <w:r>
+        <w:lastRenderedPageBreak/>
         <w:t>Identified experimental limitations and offered guidance to produce usable data for the future experiments</w:t>
       </w:r>
     </w:p>
@@ -4572,6 +4759,7 @@
   <w:style w:type="character" w:default="1" w:styleId="DefaultParagraphFont">
     <w:name w:val="Default Paragraph Font"/>
     <w:uiPriority w:val="1"/>
+    <w:semiHidden/>
     <w:unhideWhenUsed/>
   </w:style>
   <w:style w:type="table" w:default="1" w:styleId="TableNormal">

</xml_diff>